<commit_message>
Research _Figure enhanced, Overall Research-design section updated
</commit_message>
<xml_diff>
--- a/Thesis-Defense/defense/Thesis Report/research workflow.docx
+++ b/Thesis-Defense/defense/Thesis Report/research workflow.docx
@@ -38,7 +38,456 @@
       </w:r>
     </w:p>
     <w:p/>
-    <w:p/>
+    <w:p>
+      <w:pPr>
+        <w:rPr>
+          <w:sz w:val="26"/>
+          <w:szCs w:val="26"/>
+        </w:rPr>
+      </w:pPr>
+      <w:r>
+        <w:rPr>
+          <w:sz w:val="26"/>
+          <w:szCs w:val="26"/>
+        </w:rPr>
+        <w:t>Design :</w:t>
+      </w:r>
+    </w:p>
+    <w:p>
+      <w:pPr>
+        <w:rPr>
+          <w:sz w:val="26"/>
+          <w:szCs w:val="26"/>
+        </w:rPr>
+      </w:pPr>
+      <w:r>
+        <w:rPr>
+          <w:sz w:val="26"/>
+          <w:szCs w:val="26"/>
+        </w:rPr>
+        <w:t>Data</w:t>
+      </w:r>
+      <w:r>
+        <w:rPr>
+          <w:sz w:val="26"/>
+          <w:szCs w:val="26"/>
+        </w:rPr>
+        <w:t xml:space="preserve"> </w:t>
+      </w:r>
+      <w:r>
+        <w:rPr>
+          <w:sz w:val="26"/>
+          <w:szCs w:val="26"/>
+        </w:rPr>
+        <w:t>Collection</w:t>
+      </w:r>
+    </w:p>
+    <w:p>
+      <w:pPr>
+        <w:rPr>
+          <w:sz w:val="26"/>
+          <w:szCs w:val="26"/>
+        </w:rPr>
+      </w:pPr>
+      <w:r>
+        <w:rPr>
+          <w:sz w:val="26"/>
+          <w:szCs w:val="26"/>
+        </w:rPr>
+        <w:t>Environment</w:t>
+      </w:r>
+      <w:r>
+        <w:rPr>
+          <w:sz w:val="26"/>
+          <w:szCs w:val="26"/>
+        </w:rPr>
+        <w:t xml:space="preserve"> </w:t>
+      </w:r>
+      <w:r>
+        <w:rPr>
+          <w:sz w:val="26"/>
+          <w:szCs w:val="26"/>
+        </w:rPr>
+        <w:t xml:space="preserve">Setup </w:t>
+      </w:r>
+    </w:p>
+    <w:p>
+      <w:pPr>
+        <w:rPr>
+          <w:sz w:val="26"/>
+          <w:szCs w:val="26"/>
+        </w:rPr>
+      </w:pPr>
+      <w:r>
+        <w:rPr>
+          <w:sz w:val="26"/>
+          <w:szCs w:val="26"/>
+        </w:rPr>
+        <w:t>Custom</w:t>
+      </w:r>
+      <w:r>
+        <w:rPr>
+          <w:sz w:val="26"/>
+          <w:szCs w:val="26"/>
+        </w:rPr>
+        <w:t xml:space="preserve"> </w:t>
+      </w:r>
+      <w:r>
+        <w:rPr>
+          <w:sz w:val="26"/>
+          <w:szCs w:val="26"/>
+        </w:rPr>
+        <w:t>Road</w:t>
+      </w:r>
+      <w:r>
+        <w:rPr>
+          <w:sz w:val="26"/>
+          <w:szCs w:val="26"/>
+        </w:rPr>
+        <w:t xml:space="preserve"> </w:t>
+      </w:r>
+      <w:r>
+        <w:rPr>
+          <w:sz w:val="26"/>
+          <w:szCs w:val="26"/>
+        </w:rPr>
+        <w:t>Network</w:t>
+      </w:r>
+      <w:r>
+        <w:rPr>
+          <w:sz w:val="26"/>
+          <w:szCs w:val="26"/>
+        </w:rPr>
+        <w:t xml:space="preserve"> </w:t>
+      </w:r>
+      <w:r>
+        <w:rPr>
+          <w:sz w:val="26"/>
+          <w:szCs w:val="26"/>
+        </w:rPr>
+        <w:t xml:space="preserve">Design </w:t>
+      </w:r>
+    </w:p>
+    <w:p>
+      <w:pPr>
+        <w:rPr>
+          <w:sz w:val="26"/>
+          <w:szCs w:val="26"/>
+        </w:rPr>
+      </w:pPr>
+      <w:r>
+        <w:rPr>
+          <w:sz w:val="26"/>
+          <w:szCs w:val="26"/>
+        </w:rPr>
+        <w:t>Traffic Light System Placement</w:t>
+      </w:r>
+    </w:p>
+    <w:p>
+      <w:pPr>
+        <w:rPr>
+          <w:sz w:val="26"/>
+          <w:szCs w:val="26"/>
+        </w:rPr>
+      </w:pPr>
+      <w:r>
+        <w:rPr>
+          <w:sz w:val="26"/>
+          <w:szCs w:val="26"/>
+        </w:rPr>
+        <w:t>Charging</w:t>
+      </w:r>
+      <w:r>
+        <w:rPr>
+          <w:sz w:val="26"/>
+          <w:szCs w:val="26"/>
+        </w:rPr>
+        <w:t xml:space="preserve"> </w:t>
+      </w:r>
+      <w:r>
+        <w:rPr>
+          <w:sz w:val="26"/>
+          <w:szCs w:val="26"/>
+        </w:rPr>
+        <w:t>Station</w:t>
+      </w:r>
+      <w:r>
+        <w:rPr>
+          <w:sz w:val="26"/>
+          <w:szCs w:val="26"/>
+        </w:rPr>
+        <w:t xml:space="preserve"> </w:t>
+      </w:r>
+      <w:r>
+        <w:rPr>
+          <w:sz w:val="26"/>
+          <w:szCs w:val="26"/>
+        </w:rPr>
+        <w:t xml:space="preserve">Placement </w:t>
+      </w:r>
+    </w:p>
+    <w:p>
+      <w:pPr>
+        <w:rPr>
+          <w:sz w:val="26"/>
+          <w:szCs w:val="26"/>
+        </w:rPr>
+      </w:pPr>
+      <w:r>
+        <w:rPr>
+          <w:sz w:val="26"/>
+          <w:szCs w:val="26"/>
+        </w:rPr>
+        <w:t>Vehicle</w:t>
+      </w:r>
+      <w:r>
+        <w:rPr>
+          <w:sz w:val="26"/>
+          <w:szCs w:val="26"/>
+        </w:rPr>
+        <w:t xml:space="preserve"> </w:t>
+      </w:r>
+      <w:r>
+        <w:rPr>
+          <w:sz w:val="26"/>
+          <w:szCs w:val="26"/>
+        </w:rPr>
+        <w:t>Configuration</w:t>
+      </w:r>
+      <w:r>
+        <w:rPr>
+          <w:sz w:val="26"/>
+          <w:szCs w:val="26"/>
+        </w:rPr>
+        <w:t xml:space="preserve"> </w:t>
+      </w:r>
+      <w:r>
+        <w:rPr>
+          <w:sz w:val="26"/>
+          <w:szCs w:val="26"/>
+        </w:rPr>
+        <w:t>in</w:t>
+      </w:r>
+      <w:r>
+        <w:rPr>
+          <w:sz w:val="26"/>
+          <w:szCs w:val="26"/>
+        </w:rPr>
+        <w:t xml:space="preserve"> </w:t>
+      </w:r>
+      <w:r>
+        <w:rPr>
+          <w:sz w:val="26"/>
+          <w:szCs w:val="26"/>
+        </w:rPr>
+        <w:t xml:space="preserve">SUMO </w:t>
+      </w:r>
+    </w:p>
+    <w:p>
+      <w:pPr>
+        <w:rPr>
+          <w:sz w:val="26"/>
+          <w:szCs w:val="26"/>
+        </w:rPr>
+      </w:pPr>
+      <w:r>
+        <w:rPr>
+          <w:sz w:val="26"/>
+          <w:szCs w:val="26"/>
+        </w:rPr>
+        <w:t xml:space="preserve">Route Creation &amp; </w:t>
+      </w:r>
+      <w:r>
+        <w:rPr>
+          <w:sz w:val="26"/>
+          <w:szCs w:val="26"/>
+        </w:rPr>
+        <w:t>Vehicle</w:t>
+      </w:r>
+      <w:r>
+        <w:rPr>
+          <w:sz w:val="26"/>
+          <w:szCs w:val="26"/>
+        </w:rPr>
+        <w:t xml:space="preserve"> </w:t>
+      </w:r>
+      <w:r>
+        <w:rPr>
+          <w:sz w:val="26"/>
+          <w:szCs w:val="26"/>
+        </w:rPr>
+        <w:t>Fleet</w:t>
+      </w:r>
+      <w:r>
+        <w:rPr>
+          <w:sz w:val="26"/>
+          <w:szCs w:val="26"/>
+        </w:rPr>
+        <w:t xml:space="preserve"> </w:t>
+      </w:r>
+      <w:r>
+        <w:rPr>
+          <w:sz w:val="26"/>
+          <w:szCs w:val="26"/>
+        </w:rPr>
+        <w:t xml:space="preserve">Characterization </w:t>
+      </w:r>
+    </w:p>
+    <w:p>
+      <w:pPr>
+        <w:rPr>
+          <w:sz w:val="26"/>
+          <w:szCs w:val="26"/>
+        </w:rPr>
+      </w:pPr>
+      <w:r>
+        <w:rPr>
+          <w:sz w:val="26"/>
+          <w:szCs w:val="26"/>
+        </w:rPr>
+        <w:t>Smart Charging Logic Implementation</w:t>
+      </w:r>
+    </w:p>
+    <w:p>
+      <w:pPr>
+        <w:rPr>
+          <w:sz w:val="26"/>
+          <w:szCs w:val="26"/>
+        </w:rPr>
+      </w:pPr>
+      <w:r>
+        <w:rPr>
+          <w:sz w:val="26"/>
+          <w:szCs w:val="26"/>
+        </w:rPr>
+        <w:t>Simulation</w:t>
+      </w:r>
+      <w:r>
+        <w:rPr>
+          <w:sz w:val="26"/>
+          <w:szCs w:val="26"/>
+        </w:rPr>
+        <w:t xml:space="preserve"> </w:t>
+      </w:r>
+      <w:r>
+        <w:rPr>
+          <w:sz w:val="26"/>
+          <w:szCs w:val="26"/>
+        </w:rPr>
+        <w:t>Execution</w:t>
+      </w:r>
+      <w:r>
+        <w:rPr>
+          <w:sz w:val="26"/>
+          <w:szCs w:val="26"/>
+        </w:rPr>
+        <w:t xml:space="preserve"> </w:t>
+      </w:r>
+      <w:r>
+        <w:rPr>
+          <w:sz w:val="26"/>
+          <w:szCs w:val="26"/>
+        </w:rPr>
+        <w:t>with</w:t>
+      </w:r>
+      <w:r>
+        <w:rPr>
+          <w:sz w:val="26"/>
+          <w:szCs w:val="26"/>
+        </w:rPr>
+        <w:t xml:space="preserve"> </w:t>
+      </w:r>
+      <w:proofErr w:type="spellStart"/>
+      <w:r>
+        <w:rPr>
+          <w:sz w:val="26"/>
+          <w:szCs w:val="26"/>
+        </w:rPr>
+        <w:t>TraCI</w:t>
+      </w:r>
+      <w:proofErr w:type="spellEnd"/>
+      <w:r>
+        <w:rPr>
+          <w:sz w:val="26"/>
+          <w:szCs w:val="26"/>
+        </w:rPr>
+        <w:t xml:space="preserve"> </w:t>
+      </w:r>
+    </w:p>
+    <w:p>
+      <w:pPr>
+        <w:rPr>
+          <w:sz w:val="26"/>
+          <w:szCs w:val="26"/>
+        </w:rPr>
+      </w:pPr>
+      <w:r>
+        <w:rPr>
+          <w:sz w:val="26"/>
+          <w:szCs w:val="26"/>
+        </w:rPr>
+        <w:t>Real-Time</w:t>
+      </w:r>
+      <w:r>
+        <w:rPr>
+          <w:sz w:val="26"/>
+          <w:szCs w:val="26"/>
+        </w:rPr>
+        <w:t xml:space="preserve"> </w:t>
+      </w:r>
+      <w:r>
+        <w:rPr>
+          <w:sz w:val="26"/>
+          <w:szCs w:val="26"/>
+        </w:rPr>
+        <w:t>Data</w:t>
+      </w:r>
+      <w:r>
+        <w:rPr>
+          <w:sz w:val="26"/>
+          <w:szCs w:val="26"/>
+        </w:rPr>
+        <w:t xml:space="preserve"> </w:t>
+      </w:r>
+      <w:r>
+        <w:rPr>
+          <w:sz w:val="26"/>
+          <w:szCs w:val="26"/>
+        </w:rPr>
+        <w:t xml:space="preserve">Extraction </w:t>
+      </w:r>
+    </w:p>
+    <w:p>
+      <w:pPr>
+        <w:rPr>
+          <w:sz w:val="26"/>
+          <w:szCs w:val="26"/>
+        </w:rPr>
+      </w:pPr>
+      <w:r>
+        <w:rPr>
+          <w:sz w:val="26"/>
+          <w:szCs w:val="26"/>
+        </w:rPr>
+        <w:t>Data Analysis</w:t>
+      </w:r>
+    </w:p>
+    <w:p>
+      <w:pPr>
+        <w:rPr>
+          <w:sz w:val="26"/>
+          <w:szCs w:val="26"/>
+        </w:rPr>
+      </w:pPr>
+    </w:p>
+    <w:p>
+      <w:pPr>
+        <w:rPr>
+          <w:sz w:val="26"/>
+          <w:szCs w:val="26"/>
+        </w:rPr>
+      </w:pPr>
+    </w:p>
     <w:p/>
     <w:p>
       <w:r>
@@ -48,18 +497,18 @@
         <mc:AlternateContent>
           <mc:Choice Requires="wps">
             <w:drawing>
-              <wp:anchor distT="0" distB="0" distL="114300" distR="114300" simplePos="0" relativeHeight="251621888" behindDoc="0" locked="0" layoutInCell="1" allowOverlap="1" wp14:anchorId="0703352D" wp14:editId="6C91E316">
+              <wp:anchor distT="0" distB="0" distL="114300" distR="114300" simplePos="0" relativeHeight="251621888" behindDoc="0" locked="0" layoutInCell="1" allowOverlap="1" wp14:anchorId="207C197D" wp14:editId="0DACE7EC">
                 <wp:simplePos x="0" y="0"/>
                 <wp:positionH relativeFrom="column">
-                  <wp:posOffset>-361936</wp:posOffset>
+                  <wp:posOffset>1602849</wp:posOffset>
                 </wp:positionH>
                 <wp:positionV relativeFrom="paragraph">
-                  <wp:posOffset>398322</wp:posOffset>
+                  <wp:posOffset>65668</wp:posOffset>
                 </wp:positionV>
                 <wp:extent cx="2073349" cy="861238"/>
                 <wp:effectExtent l="0" t="0" r="22225" b="15240"/>
                 <wp:wrapNone/>
-                <wp:docPr id="1" name="Rectangle 1"/>
+                <wp:docPr id="10" name="Rectangle 10"/>
                 <wp:cNvGraphicFramePr/>
                 <a:graphic xmlns:a="http://schemas.openxmlformats.org/drawingml/2006/main">
                   <a:graphicData uri="http://schemas.microsoft.com/office/word/2010/wordprocessingShape">
@@ -138,7 +587,7 @@
           </mc:Choice>
           <mc:Fallback>
             <w:pict>
-              <v:rect w14:anchorId="0703352D" id="Rectangle 1" o:spid="_x0000_s1026" style="position:absolute;margin-left:-28.5pt;margin-top:31.35pt;width:163.25pt;height:67.8pt;z-index:251621888;visibility:visible;mso-wrap-style:square;mso-wrap-distance-left:9pt;mso-wrap-distance-top:0;mso-wrap-distance-right:9pt;mso-wrap-distance-bottom:0;mso-position-horizontal:absolute;mso-position-horizontal-relative:text;mso-position-vertical:absolute;mso-position-vertical-relative:text;v-text-anchor:middle" o:gfxdata="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" fillcolor="#5a5a5a [2109]" strokecolor="#0a121c [484]" strokeweight="2pt">
+              <v:rect w14:anchorId="207C197D" id="Rectangle 10" o:spid="_x0000_s1026" style="position:absolute;margin-left:126.2pt;margin-top:5.15pt;width:163.25pt;height:67.8pt;z-index:251621888;visibility:visible;mso-wrap-style:square;mso-wrap-distance-left:9pt;mso-wrap-distance-top:0;mso-wrap-distance-right:9pt;mso-wrap-distance-bottom:0;mso-position-horizontal:absolute;mso-position-horizontal-relative:text;mso-position-vertical:absolute;mso-position-vertical-relative:text;v-text-anchor:middle" o:gfxdata="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" fillcolor="#5a5a5a [2109]" strokecolor="#0a121c [484]" strokeweight="2pt">
                 <v:textbox>
                   <w:txbxContent>
                     <w:p>
@@ -173,24 +622,370 @@
         </mc:AlternateContent>
       </w:r>
     </w:p>
+    <w:p/>
     <w:p>
       <w:r>
         <w:rPr>
           <w:noProof/>
         </w:rPr>
+        <w:lastRenderedPageBreak/>
         <mc:AlternateContent>
           <mc:Choice Requires="wps">
             <w:drawing>
-              <wp:anchor distT="0" distB="0" distL="114300" distR="114300" simplePos="0" relativeHeight="251685376" behindDoc="0" locked="0" layoutInCell="1" allowOverlap="1" wp14:anchorId="4B59E96A" wp14:editId="3A8E0B09">
+              <wp:anchor distT="0" distB="0" distL="114300" distR="114300" simplePos="0" relativeHeight="251685376" behindDoc="0" locked="0" layoutInCell="1" allowOverlap="1" wp14:anchorId="3D83E7B7" wp14:editId="770D78A0">
                 <wp:simplePos x="0" y="0"/>
                 <wp:positionH relativeFrom="column">
-                  <wp:posOffset>2987144</wp:posOffset>
+                  <wp:posOffset>2667635</wp:posOffset>
                 </wp:positionH>
                 <wp:positionV relativeFrom="paragraph">
-                  <wp:posOffset>1723537</wp:posOffset>
+                  <wp:posOffset>304165</wp:posOffset>
                 </wp:positionV>
-                <wp:extent cx="255182" cy="287079"/>
-                <wp:effectExtent l="19050" t="19050" r="12065" b="36830"/>
+                <wp:extent cx="1276709" cy="594995"/>
+                <wp:effectExtent l="0" t="0" r="19050" b="14605"/>
+                <wp:wrapNone/>
+                <wp:docPr id="13" name="Rectangle 13"/>
+                <wp:cNvGraphicFramePr/>
+                <a:graphic xmlns:a="http://schemas.openxmlformats.org/drawingml/2006/main">
+                  <a:graphicData uri="http://schemas.microsoft.com/office/word/2010/wordprocessingShape">
+                    <wps:wsp>
+                      <wps:cNvSpPr/>
+                      <wps:spPr>
+                        <a:xfrm>
+                          <a:off x="0" y="0"/>
+                          <a:ext cx="1276709" cy="594995"/>
+                        </a:xfrm>
+                        <a:prstGeom prst="rect">
+                          <a:avLst/>
+                        </a:prstGeom>
+                        <a:solidFill>
+                          <a:schemeClr val="tx1">
+                            <a:lumMod val="65000"/>
+                            <a:lumOff val="35000"/>
+                          </a:schemeClr>
+                        </a:solidFill>
+                      </wps:spPr>
+                      <wps:style>
+                        <a:lnRef idx="2">
+                          <a:schemeClr val="accent1">
+                            <a:shade val="15000"/>
+                          </a:schemeClr>
+                        </a:lnRef>
+                        <a:fillRef idx="1">
+                          <a:schemeClr val="accent1"/>
+                        </a:fillRef>
+                        <a:effectRef idx="0">
+                          <a:schemeClr val="accent1"/>
+                        </a:effectRef>
+                        <a:fontRef idx="minor">
+                          <a:schemeClr val="lt1"/>
+                        </a:fontRef>
+                      </wps:style>
+                      <wps:txbx>
+                        <w:txbxContent>
+                          <w:p>
+                            <w:pPr>
+                              <w:rPr>
+                                <w:sz w:val="26"/>
+                                <w:szCs w:val="26"/>
+                              </w:rPr>
+                            </w:pPr>
+                            <w:r>
+                              <w:rPr>
+                                <w:sz w:val="26"/>
+                                <w:szCs w:val="26"/>
+                              </w:rPr>
+                              <w:t>Custom</w:t>
+                            </w:r>
+                            <w:r>
+                              <w:rPr>
+                                <w:sz w:val="26"/>
+                                <w:szCs w:val="26"/>
+                              </w:rPr>
+                              <w:t xml:space="preserve"> </w:t>
+                            </w:r>
+                            <w:r>
+                              <w:rPr>
+                                <w:sz w:val="26"/>
+                                <w:szCs w:val="26"/>
+                              </w:rPr>
+                              <w:t>Road</w:t>
+                            </w:r>
+                            <w:r>
+                              <w:rPr>
+                                <w:sz w:val="26"/>
+                                <w:szCs w:val="26"/>
+                              </w:rPr>
+                              <w:t xml:space="preserve"> </w:t>
+                            </w:r>
+                            <w:r>
+                              <w:rPr>
+                                <w:sz w:val="26"/>
+                                <w:szCs w:val="26"/>
+                              </w:rPr>
+                              <w:t>Network</w:t>
+                            </w:r>
+                            <w:r>
+                              <w:rPr>
+                                <w:sz w:val="26"/>
+                                <w:szCs w:val="26"/>
+                              </w:rPr>
+                              <w:t xml:space="preserve"> </w:t>
+                            </w:r>
+                            <w:r>
+                              <w:rPr>
+                                <w:sz w:val="26"/>
+                                <w:szCs w:val="26"/>
+                              </w:rPr>
+                              <w:t xml:space="preserve">Design </w:t>
+                            </w:r>
+                          </w:p>
+                          <w:p>
+                            <w:pPr>
+                              <w:jc w:val="center"/>
+                              <w:rPr>
+                                <w:sz w:val="40"/>
+                                <w:szCs w:val="40"/>
+                              </w:rPr>
+                            </w:pPr>
+                          </w:p>
+                        </w:txbxContent>
+                      </wps:txbx>
+                      <wps:bodyPr rot="0" spcFirstLastPara="0" vertOverflow="overflow" horzOverflow="overflow" vert="horz" wrap="square" lIns="91440" tIns="45720" rIns="91440" bIns="45720" numCol="1" spcCol="0" rtlCol="0" fromWordArt="0" anchor="ctr" anchorCtr="0" forceAA="0" compatLnSpc="1">
+                        <a:prstTxWarp prst="textNoShape">
+                          <a:avLst/>
+                        </a:prstTxWarp>
+                        <a:noAutofit/>
+                      </wps:bodyPr>
+                    </wps:wsp>
+                  </a:graphicData>
+                </a:graphic>
+                <wp14:sizeRelH relativeFrom="margin">
+                  <wp14:pctWidth>0</wp14:pctWidth>
+                </wp14:sizeRelH>
+                <wp14:sizeRelV relativeFrom="margin">
+                  <wp14:pctHeight>0</wp14:pctHeight>
+                </wp14:sizeRelV>
+              </wp:anchor>
+            </w:drawing>
+          </mc:Choice>
+          <mc:Fallback>
+            <w:pict>
+              <v:rect w14:anchorId="3D83E7B7" id="Rectangle 13" o:spid="_x0000_s1027" style="position:absolute;margin-left:210.05pt;margin-top:23.95pt;width:100.55pt;height:46.85pt;z-index:251685376;visibility:visible;mso-wrap-style:square;mso-width-percent:0;mso-height-percent:0;mso-wrap-distance-left:9pt;mso-wrap-distance-top:0;mso-wrap-distance-right:9pt;mso-wrap-distance-bottom:0;mso-position-horizontal:absolute;mso-position-horizontal-relative:text;mso-position-vertical:absolute;mso-position-vertical-relative:text;mso-width-percent:0;mso-height-percent:0;mso-width-relative:margin;mso-height-relative:margin;v-text-anchor:middle" o:gfxdata="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" fillcolor="#5a5a5a [2109]" strokecolor="#0a121c [484]" strokeweight="2pt">
+                <v:textbox>
+                  <w:txbxContent>
+                    <w:p>
+                      <w:pPr>
+                        <w:rPr>
+                          <w:sz w:val="26"/>
+                          <w:szCs w:val="26"/>
+                        </w:rPr>
+                      </w:pPr>
+                      <w:r>
+                        <w:rPr>
+                          <w:sz w:val="26"/>
+                          <w:szCs w:val="26"/>
+                        </w:rPr>
+                        <w:t>Custom</w:t>
+                      </w:r>
+                      <w:r>
+                        <w:rPr>
+                          <w:sz w:val="26"/>
+                          <w:szCs w:val="26"/>
+                        </w:rPr>
+                        <w:t xml:space="preserve"> </w:t>
+                      </w:r>
+                      <w:r>
+                        <w:rPr>
+                          <w:sz w:val="26"/>
+                          <w:szCs w:val="26"/>
+                        </w:rPr>
+                        <w:t>Road</w:t>
+                      </w:r>
+                      <w:r>
+                        <w:rPr>
+                          <w:sz w:val="26"/>
+                          <w:szCs w:val="26"/>
+                        </w:rPr>
+                        <w:t xml:space="preserve"> </w:t>
+                      </w:r>
+                      <w:r>
+                        <w:rPr>
+                          <w:sz w:val="26"/>
+                          <w:szCs w:val="26"/>
+                        </w:rPr>
+                        <w:t>Network</w:t>
+                      </w:r>
+                      <w:r>
+                        <w:rPr>
+                          <w:sz w:val="26"/>
+                          <w:szCs w:val="26"/>
+                        </w:rPr>
+                        <w:t xml:space="preserve"> </w:t>
+                      </w:r>
+                      <w:r>
+                        <w:rPr>
+                          <w:sz w:val="26"/>
+                          <w:szCs w:val="26"/>
+                        </w:rPr>
+                        <w:t xml:space="preserve">Design </w:t>
+                      </w:r>
+                    </w:p>
+                    <w:p>
+                      <w:pPr>
+                        <w:jc w:val="center"/>
+                        <w:rPr>
+                          <w:sz w:val="40"/>
+                          <w:szCs w:val="40"/>
+                        </w:rPr>
+                      </w:pPr>
+                    </w:p>
+                  </w:txbxContent>
+                </v:textbox>
+              </v:rect>
+            </w:pict>
+          </mc:Fallback>
+        </mc:AlternateContent>
+      </w:r>
+      <w:r>
+        <w:rPr>
+          <w:noProof/>
+        </w:rPr>
+        <mc:AlternateContent>
+          <mc:Choice Requires="wps">
+            <w:drawing>
+              <wp:anchor distT="0" distB="0" distL="114300" distR="114300" simplePos="0" relativeHeight="251722240" behindDoc="0" locked="0" layoutInCell="1" allowOverlap="1" wp14:anchorId="49AB4FDB" wp14:editId="4202024B">
+                <wp:simplePos x="0" y="0"/>
+                <wp:positionH relativeFrom="column">
+                  <wp:posOffset>4648200</wp:posOffset>
+                </wp:positionH>
+                <wp:positionV relativeFrom="paragraph">
+                  <wp:posOffset>266700</wp:posOffset>
+                </wp:positionV>
+                <wp:extent cx="1276709" cy="762000"/>
+                <wp:effectExtent l="0" t="0" r="19050" b="19050"/>
+                <wp:wrapNone/>
+                <wp:docPr id="15" name="Rectangle 15"/>
+                <wp:cNvGraphicFramePr/>
+                <a:graphic xmlns:a="http://schemas.openxmlformats.org/drawingml/2006/main">
+                  <a:graphicData uri="http://schemas.microsoft.com/office/word/2010/wordprocessingShape">
+                    <wps:wsp>
+                      <wps:cNvSpPr/>
+                      <wps:spPr>
+                        <a:xfrm>
+                          <a:off x="0" y="0"/>
+                          <a:ext cx="1276709" cy="762000"/>
+                        </a:xfrm>
+                        <a:prstGeom prst="rect">
+                          <a:avLst/>
+                        </a:prstGeom>
+                        <a:solidFill>
+                          <a:schemeClr val="tx1">
+                            <a:lumMod val="65000"/>
+                            <a:lumOff val="35000"/>
+                          </a:schemeClr>
+                        </a:solidFill>
+                      </wps:spPr>
+                      <wps:style>
+                        <a:lnRef idx="2">
+                          <a:schemeClr val="accent1">
+                            <a:shade val="15000"/>
+                          </a:schemeClr>
+                        </a:lnRef>
+                        <a:fillRef idx="1">
+                          <a:schemeClr val="accent1"/>
+                        </a:fillRef>
+                        <a:effectRef idx="0">
+                          <a:schemeClr val="accent1"/>
+                        </a:effectRef>
+                        <a:fontRef idx="minor">
+                          <a:schemeClr val="lt1"/>
+                        </a:fontRef>
+                      </wps:style>
+                      <wps:txbx>
+                        <w:txbxContent>
+                          <w:p>
+                            <w:pPr>
+                              <w:jc w:val="center"/>
+                              <w:rPr>
+                                <w:sz w:val="40"/>
+                                <w:szCs w:val="40"/>
+                              </w:rPr>
+                            </w:pPr>
+                            <w:r>
+                              <w:rPr>
+                                <w:sz w:val="26"/>
+                                <w:szCs w:val="26"/>
+                              </w:rPr>
+                              <w:t>Traffic Light System Placement</w:t>
+                            </w:r>
+                          </w:p>
+                        </w:txbxContent>
+                      </wps:txbx>
+                      <wps:bodyPr rot="0" spcFirstLastPara="0" vertOverflow="overflow" horzOverflow="overflow" vert="horz" wrap="square" lIns="91440" tIns="45720" rIns="91440" bIns="45720" numCol="1" spcCol="0" rtlCol="0" fromWordArt="0" anchor="ctr" anchorCtr="0" forceAA="0" compatLnSpc="1">
+                        <a:prstTxWarp prst="textNoShape">
+                          <a:avLst/>
+                        </a:prstTxWarp>
+                        <a:noAutofit/>
+                      </wps:bodyPr>
+                    </wps:wsp>
+                  </a:graphicData>
+                </a:graphic>
+                <wp14:sizeRelH relativeFrom="margin">
+                  <wp14:pctWidth>0</wp14:pctWidth>
+                </wp14:sizeRelH>
+                <wp14:sizeRelV relativeFrom="margin">
+                  <wp14:pctHeight>0</wp14:pctHeight>
+                </wp14:sizeRelV>
+              </wp:anchor>
+            </w:drawing>
+          </mc:Choice>
+          <mc:Fallback>
+            <w:pict>
+              <v:rect w14:anchorId="49AB4FDB" id="Rectangle 15" o:spid="_x0000_s1028" style="position:absolute;margin-left:366pt;margin-top:21pt;width:100.55pt;height:60pt;z-index:251722240;visibility:visible;mso-wrap-style:square;mso-width-percent:0;mso-height-percent:0;mso-wrap-distance-left:9pt;mso-wrap-distance-top:0;mso-wrap-distance-right:9pt;mso-wrap-distance-bottom:0;mso-position-horizontal:absolute;mso-position-horizontal-relative:text;mso-position-vertical:absolute;mso-position-vertical-relative:text;mso-width-percent:0;mso-height-percent:0;mso-width-relative:margin;mso-height-relative:margin;v-text-anchor:middle" o:gfxdata="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" fillcolor="#5a5a5a [2109]" strokecolor="#0a121c [484]" strokeweight="2pt">
+                <v:textbox>
+                  <w:txbxContent>
+                    <w:p>
+                      <w:pPr>
+                        <w:jc w:val="center"/>
+                        <w:rPr>
+                          <w:sz w:val="40"/>
+                          <w:szCs w:val="40"/>
+                        </w:rPr>
+                      </w:pPr>
+                      <w:r>
+                        <w:rPr>
+                          <w:sz w:val="26"/>
+                          <w:szCs w:val="26"/>
+                        </w:rPr>
+                        <w:t>Traffic Light System Placement</w:t>
+                      </w:r>
+                    </w:p>
+                  </w:txbxContent>
+                </v:textbox>
+              </v:rect>
+            </w:pict>
+          </mc:Fallback>
+        </mc:AlternateContent>
+      </w:r>
+    </w:p>
+    <w:p>
+      <w:r>
+        <w:rPr>
+          <w:noProof/>
+        </w:rPr>
+        <mc:AlternateContent>
+          <mc:Choice Requires="wps">
+            <w:drawing>
+              <wp:anchor distT="0" distB="0" distL="114300" distR="114300" simplePos="0" relativeHeight="251523584" behindDoc="0" locked="0" layoutInCell="1" allowOverlap="1" wp14:anchorId="4B59E96A" wp14:editId="2B795105">
+                <wp:simplePos x="0" y="0"/>
+                <wp:positionH relativeFrom="column">
+                  <wp:posOffset>4153372</wp:posOffset>
+                </wp:positionH>
+                <wp:positionV relativeFrom="paragraph">
+                  <wp:posOffset>5232075</wp:posOffset>
+                </wp:positionV>
+                <wp:extent cx="314325" cy="266700"/>
+                <wp:effectExtent l="19050" t="19050" r="28575" b="38100"/>
                 <wp:wrapNone/>
                 <wp:docPr id="6" name="Arrow: Right 6"/>
                 <wp:cNvGraphicFramePr/>
@@ -201,7 +996,7 @@
                       <wps:spPr>
                         <a:xfrm rot="10800000">
                           <a:off x="0" y="0"/>
-                          <a:ext cx="255182" cy="287079"/>
+                          <a:ext cx="314325" cy="266700"/>
                         </a:xfrm>
                         <a:prstGeom prst="rightArrow">
                           <a:avLst/>
@@ -238,12 +1033,18 @@
                     </wps:wsp>
                   </a:graphicData>
                 </a:graphic>
+                <wp14:sizeRelH relativeFrom="margin">
+                  <wp14:pctWidth>0</wp14:pctWidth>
+                </wp14:sizeRelH>
+                <wp14:sizeRelV relativeFrom="margin">
+                  <wp14:pctHeight>0</wp14:pctHeight>
+                </wp14:sizeRelV>
               </wp:anchor>
             </w:drawing>
           </mc:Choice>
           <mc:Fallback>
             <w:pict>
-              <v:shapetype w14:anchorId="1CB477BF" id="_x0000_t13" coordsize="21600,21600" o:spt="13" adj="16200,5400" path="m@0,l@0@1,0@1,0@2@0@2@0,21600,21600,10800xe">
+              <v:shapetype w14:anchorId="322AF349" id="_x0000_t13" coordsize="21600,21600" o:spt="13" adj="16200,5400" path="m@0,l@0@1,0@1,0@2@0@2@0,21600,21600,10800xe">
                 <v:stroke joinstyle="miter"/>
                 <v:formulas>
                   <v:f eqn="val #0"/>
@@ -259,7 +1060,7 @@
                   <v:h position="#0,#1" xrange="0,21600" yrange="0,10800"/>
                 </v:handles>
               </v:shapetype>
-              <v:shape id="Arrow: Right 6" o:spid="_x0000_s1026" type="#_x0000_t13" style="position:absolute;margin-left:235.2pt;margin-top:135.7pt;width:20.1pt;height:22.6pt;rotation:180;z-index:251685376;visibility:visible;mso-wrap-style:square;mso-wrap-distance-left:9pt;mso-wrap-distance-top:0;mso-wrap-distance-right:9pt;mso-wrap-distance-bottom:0;mso-position-horizontal:absolute;mso-position-horizontal-relative:text;mso-position-vertical:absolute;mso-position-vertical-relative:text;v-text-anchor:middle" o:gfxdata="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" adj="10800" fillcolor="#5a5a5a [2109]" strokecolor="#0a121c [484]" strokeweight="2pt"/>
+              <v:shape id="Arrow: Right 6" o:spid="_x0000_s1026" type="#_x0000_t13" style="position:absolute;margin-left:327.05pt;margin-top:411.95pt;width:24.75pt;height:21pt;rotation:180;z-index:251523584;visibility:visible;mso-wrap-style:square;mso-width-percent:0;mso-height-percent:0;mso-wrap-distance-left:9pt;mso-wrap-distance-top:0;mso-wrap-distance-right:9pt;mso-wrap-distance-bottom:0;mso-position-horizontal:absolute;mso-position-horizontal-relative:text;mso-position-vertical:absolute;mso-position-vertical-relative:text;mso-width-percent:0;mso-height-percent:0;mso-width-relative:margin;mso-height-relative:margin;v-text-anchor:middle" o:gfxdata="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" adj="12436" fillcolor="#5a5a5a [2109]" strokecolor="#0a121c [484]" strokeweight="2pt"/>
             </w:pict>
           </mc:Fallback>
         </mc:AlternateContent>
@@ -271,27 +1072,162 @@
         <mc:AlternateContent>
           <mc:Choice Requires="wps">
             <w:drawing>
-              <wp:anchor distT="0" distB="0" distL="114300" distR="114300" simplePos="0" relativeHeight="251691520" behindDoc="0" locked="0" layoutInCell="1" allowOverlap="1" wp14:anchorId="4E28252D" wp14:editId="16F7C9A2">
+              <wp:anchor distT="0" distB="0" distL="114300" distR="114300" simplePos="0" relativeHeight="251835904" behindDoc="0" locked="0" layoutInCell="1" allowOverlap="1" wp14:anchorId="73448E1E" wp14:editId="3051F6BC">
                 <wp:simplePos x="0" y="0"/>
                 <wp:positionH relativeFrom="column">
-                  <wp:posOffset>4926108</wp:posOffset>
+                  <wp:posOffset>4572000</wp:posOffset>
                 </wp:positionH>
                 <wp:positionV relativeFrom="paragraph">
-                  <wp:posOffset>1012840</wp:posOffset>
+                  <wp:posOffset>4971799</wp:posOffset>
                 </wp:positionV>
-                <wp:extent cx="255182" cy="287079"/>
-                <wp:effectExtent l="21908" t="0" r="14922" b="33973"/>
+                <wp:extent cx="1350778" cy="800100"/>
+                <wp:effectExtent l="0" t="0" r="20955" b="19050"/>
                 <wp:wrapNone/>
-                <wp:docPr id="7" name="Arrow: Right 7"/>
+                <wp:docPr id="20" name="Rectangle 20"/>
                 <wp:cNvGraphicFramePr/>
                 <a:graphic xmlns:a="http://schemas.openxmlformats.org/drawingml/2006/main">
                   <a:graphicData uri="http://schemas.microsoft.com/office/word/2010/wordprocessingShape">
                     <wps:wsp>
                       <wps:cNvSpPr/>
                       <wps:spPr>
-                        <a:xfrm rot="5400000">
+                        <a:xfrm>
                           <a:off x="0" y="0"/>
-                          <a:ext cx="255182" cy="287079"/>
+                          <a:ext cx="1350778" cy="800100"/>
+                        </a:xfrm>
+                        <a:prstGeom prst="rect">
+                          <a:avLst/>
+                        </a:prstGeom>
+                        <a:solidFill>
+                          <a:schemeClr val="tx1">
+                            <a:lumMod val="65000"/>
+                            <a:lumOff val="35000"/>
+                          </a:schemeClr>
+                        </a:solidFill>
+                      </wps:spPr>
+                      <wps:style>
+                        <a:lnRef idx="2">
+                          <a:schemeClr val="accent1">
+                            <a:shade val="15000"/>
+                          </a:schemeClr>
+                        </a:lnRef>
+                        <a:fillRef idx="1">
+                          <a:schemeClr val="accent1"/>
+                        </a:fillRef>
+                        <a:effectRef idx="0">
+                          <a:schemeClr val="accent1"/>
+                        </a:effectRef>
+                        <a:fontRef idx="minor">
+                          <a:schemeClr val="lt1"/>
+                        </a:fontRef>
+                      </wps:style>
+                      <wps:txbx>
+                        <w:txbxContent>
+                          <w:p>
+                            <w:pPr>
+                              <w:jc w:val="center"/>
+                              <w:rPr>
+                                <w:sz w:val="40"/>
+                                <w:szCs w:val="40"/>
+                              </w:rPr>
+                            </w:pPr>
+                            <w:r>
+                              <w:rPr>
+                                <w:sz w:val="26"/>
+                                <w:szCs w:val="26"/>
+                              </w:rPr>
+                              <w:t>Smart Charging Logic Implementati</w:t>
+                            </w:r>
+                            <w:r>
+                              <w:rPr>
+                                <w:sz w:val="26"/>
+                                <w:szCs w:val="26"/>
+                              </w:rPr>
+                              <w:t>on</w:t>
+                            </w:r>
+                          </w:p>
+                        </w:txbxContent>
+                      </wps:txbx>
+                      <wps:bodyPr rot="0" spcFirstLastPara="0" vertOverflow="overflow" horzOverflow="overflow" vert="horz" wrap="square" lIns="91440" tIns="45720" rIns="91440" bIns="45720" numCol="1" spcCol="0" rtlCol="0" fromWordArt="0" anchor="ctr" anchorCtr="0" forceAA="0" compatLnSpc="1">
+                        <a:prstTxWarp prst="textNoShape">
+                          <a:avLst/>
+                        </a:prstTxWarp>
+                        <a:noAutofit/>
+                      </wps:bodyPr>
+                    </wps:wsp>
+                  </a:graphicData>
+                </a:graphic>
+                <wp14:sizeRelH relativeFrom="margin">
+                  <wp14:pctWidth>0</wp14:pctWidth>
+                </wp14:sizeRelH>
+                <wp14:sizeRelV relativeFrom="margin">
+                  <wp14:pctHeight>0</wp14:pctHeight>
+                </wp14:sizeRelV>
+              </wp:anchor>
+            </w:drawing>
+          </mc:Choice>
+          <mc:Fallback>
+            <w:pict>
+              <v:rect w14:anchorId="73448E1E" id="Rectangle 20" o:spid="_x0000_s1029" style="position:absolute;margin-left:5in;margin-top:391.5pt;width:106.35pt;height:63pt;z-index:251835904;visibility:visible;mso-wrap-style:square;mso-width-percent:0;mso-height-percent:0;mso-wrap-distance-left:9pt;mso-wrap-distance-top:0;mso-wrap-distance-right:9pt;mso-wrap-distance-bottom:0;mso-position-horizontal:absolute;mso-position-horizontal-relative:text;mso-position-vertical:absolute;mso-position-vertical-relative:text;mso-width-percent:0;mso-height-percent:0;mso-width-relative:margin;mso-height-relative:margin;v-text-anchor:middle" o:gfxdata="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" fillcolor="#5a5a5a [2109]" strokecolor="#0a121c [484]" strokeweight="2pt">
+                <v:textbox>
+                  <w:txbxContent>
+                    <w:p>
+                      <w:pPr>
+                        <w:jc w:val="center"/>
+                        <w:rPr>
+                          <w:sz w:val="40"/>
+                          <w:szCs w:val="40"/>
+                        </w:rPr>
+                      </w:pPr>
+                      <w:r>
+                        <w:rPr>
+                          <w:sz w:val="26"/>
+                          <w:szCs w:val="26"/>
+                        </w:rPr>
+                        <w:t>Smart Charging Logic Implementati</w:t>
+                      </w:r>
+                      <w:r>
+                        <w:rPr>
+                          <w:sz w:val="26"/>
+                          <w:szCs w:val="26"/>
+                        </w:rPr>
+                        <w:t>on</w:t>
+                      </w:r>
+                    </w:p>
+                  </w:txbxContent>
+                </v:textbox>
+              </v:rect>
+            </w:pict>
+          </mc:Fallback>
+        </mc:AlternateContent>
+      </w:r>
+      <w:r>
+        <w:rPr>
+          <w:noProof/>
+        </w:rPr>
+        <mc:AlternateContent>
+          <mc:Choice Requires="wps">
+            <w:drawing>
+              <wp:anchor distT="0" distB="0" distL="114300" distR="114300" simplePos="0" relativeHeight="251713024" behindDoc="0" locked="0" layoutInCell="1" allowOverlap="1" wp14:anchorId="63814920" wp14:editId="605C8AEE">
+                <wp:simplePos x="0" y="0"/>
+                <wp:positionH relativeFrom="column">
+                  <wp:posOffset>4123055</wp:posOffset>
+                </wp:positionH>
+                <wp:positionV relativeFrom="paragraph">
+                  <wp:posOffset>187960</wp:posOffset>
+                </wp:positionV>
+                <wp:extent cx="258792" cy="222490"/>
+                <wp:effectExtent l="0" t="19050" r="46355" b="44450"/>
+                <wp:wrapNone/>
+                <wp:docPr id="14" name="Arrow: Right 14"/>
+                <wp:cNvGraphicFramePr/>
+                <a:graphic xmlns:a="http://schemas.openxmlformats.org/drawingml/2006/main">
+                  <a:graphicData uri="http://schemas.microsoft.com/office/word/2010/wordprocessingShape">
+                    <wps:wsp>
+                      <wps:cNvSpPr/>
+                      <wps:spPr>
+                        <a:xfrm>
+                          <a:off x="0" y="0"/>
+                          <a:ext cx="258792" cy="222490"/>
                         </a:xfrm>
                         <a:prstGeom prst="rightArrow">
                           <a:avLst/>
@@ -328,12 +1264,18 @@
                     </wps:wsp>
                   </a:graphicData>
                 </a:graphic>
+                <wp14:sizeRelH relativeFrom="margin">
+                  <wp14:pctWidth>0</wp14:pctWidth>
+                </wp14:sizeRelH>
+                <wp14:sizeRelV relativeFrom="margin">
+                  <wp14:pctHeight>0</wp14:pctHeight>
+                </wp14:sizeRelV>
               </wp:anchor>
             </w:drawing>
           </mc:Choice>
           <mc:Fallback>
             <w:pict>
-              <v:shape w14:anchorId="5995EF1C" id="Arrow: Right 7" o:spid="_x0000_s1026" type="#_x0000_t13" style="position:absolute;margin-left:387.9pt;margin-top:79.75pt;width:20.1pt;height:22.6pt;rotation:90;z-index:251691520;visibility:visible;mso-wrap-style:square;mso-wrap-distance-left:9pt;mso-wrap-distance-top:0;mso-wrap-distance-right:9pt;mso-wrap-distance-bottom:0;mso-position-horizontal:absolute;mso-position-horizontal-relative:text;mso-position-vertical:absolute;mso-position-vertical-relative:text;v-text-anchor:middle" o:gfxdata="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" adj="10800" fillcolor="#5a5a5a [2109]" strokecolor="#0a121c [484]" strokeweight="2pt"/>
+              <v:shape w14:anchorId="79B885A0" id="Arrow: Right 14" o:spid="_x0000_s1026" type="#_x0000_t13" style="position:absolute;margin-left:324.65pt;margin-top:14.8pt;width:20.4pt;height:17.5pt;z-index:251713024;visibility:visible;mso-wrap-style:square;mso-width-percent:0;mso-height-percent:0;mso-wrap-distance-left:9pt;mso-wrap-distance-top:0;mso-wrap-distance-right:9pt;mso-wrap-distance-bottom:0;mso-position-horizontal:absolute;mso-position-horizontal-relative:text;mso-position-vertical:absolute;mso-position-vertical-relative:text;mso-width-percent:0;mso-height-percent:0;mso-width-relative:margin;mso-height-relative:margin;v-text-anchor:middle" o:gfxdata="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" adj="12315" fillcolor="#5a5a5a [2109]" strokecolor="#0a121c [484]" strokeweight="2pt"/>
             </w:pict>
           </mc:Fallback>
         </mc:AlternateContent>
@@ -345,18 +1287,18 @@
         <mc:AlternateContent>
           <mc:Choice Requires="wps">
             <w:drawing>
-              <wp:anchor distT="0" distB="0" distL="114300" distR="114300" simplePos="0" relativeHeight="251696640" behindDoc="0" locked="0" layoutInCell="1" allowOverlap="1" wp14:anchorId="2D3EDEB6" wp14:editId="5FEF0894">
+              <wp:anchor distT="0" distB="0" distL="114300" distR="114300" simplePos="0" relativeHeight="251913728" behindDoc="0" locked="0" layoutInCell="1" allowOverlap="1" wp14:anchorId="39039C83" wp14:editId="49B1E869">
                 <wp:simplePos x="0" y="0"/>
                 <wp:positionH relativeFrom="column">
-                  <wp:posOffset>4298521</wp:posOffset>
+                  <wp:posOffset>-352425</wp:posOffset>
                 </wp:positionH>
                 <wp:positionV relativeFrom="paragraph">
-                  <wp:posOffset>395885</wp:posOffset>
+                  <wp:posOffset>5010785</wp:posOffset>
                 </wp:positionV>
-                <wp:extent cx="255182" cy="287079"/>
-                <wp:effectExtent l="0" t="19050" r="31115" b="36830"/>
+                <wp:extent cx="923925" cy="781050"/>
+                <wp:effectExtent l="0" t="0" r="28575" b="19050"/>
                 <wp:wrapNone/>
-                <wp:docPr id="8" name="Arrow: Right 8"/>
+                <wp:docPr id="24" name="Rectangle 24"/>
                 <wp:cNvGraphicFramePr/>
                 <a:graphic xmlns:a="http://schemas.openxmlformats.org/drawingml/2006/main">
                   <a:graphicData uri="http://schemas.microsoft.com/office/word/2010/wordprocessingShape">
@@ -365,7 +1307,128 @@
                       <wps:spPr>
                         <a:xfrm>
                           <a:off x="0" y="0"/>
-                          <a:ext cx="255182" cy="287079"/>
+                          <a:ext cx="923925" cy="781050"/>
+                        </a:xfrm>
+                        <a:prstGeom prst="rect">
+                          <a:avLst/>
+                        </a:prstGeom>
+                        <a:solidFill>
+                          <a:schemeClr val="tx1">
+                            <a:lumMod val="65000"/>
+                            <a:lumOff val="35000"/>
+                          </a:schemeClr>
+                        </a:solidFill>
+                      </wps:spPr>
+                      <wps:style>
+                        <a:lnRef idx="2">
+                          <a:schemeClr val="accent1">
+                            <a:shade val="15000"/>
+                          </a:schemeClr>
+                        </a:lnRef>
+                        <a:fillRef idx="1">
+                          <a:schemeClr val="accent1"/>
+                        </a:fillRef>
+                        <a:effectRef idx="0">
+                          <a:schemeClr val="accent1"/>
+                        </a:effectRef>
+                        <a:fontRef idx="minor">
+                          <a:schemeClr val="lt1"/>
+                        </a:fontRef>
+                      </wps:style>
+                      <wps:txbx>
+                        <w:txbxContent>
+                          <w:p>
+                            <w:pPr>
+                              <w:jc w:val="center"/>
+                              <w:rPr>
+                                <w:sz w:val="26"/>
+                                <w:szCs w:val="26"/>
+                              </w:rPr>
+                            </w:pPr>
+                            <w:r>
+                              <w:rPr>
+                                <w:sz w:val="26"/>
+                                <w:szCs w:val="26"/>
+                              </w:rPr>
+                              <w:t>Data Analysis</w:t>
+                            </w:r>
+                          </w:p>
+                        </w:txbxContent>
+                      </wps:txbx>
+                      <wps:bodyPr rot="0" spcFirstLastPara="0" vertOverflow="overflow" horzOverflow="overflow" vert="horz" wrap="square" lIns="91440" tIns="45720" rIns="91440" bIns="45720" numCol="1" spcCol="0" rtlCol="0" fromWordArt="0" anchor="ctr" anchorCtr="0" forceAA="0" compatLnSpc="1">
+                        <a:prstTxWarp prst="textNoShape">
+                          <a:avLst/>
+                        </a:prstTxWarp>
+                        <a:noAutofit/>
+                      </wps:bodyPr>
+                    </wps:wsp>
+                  </a:graphicData>
+                </a:graphic>
+                <wp14:sizeRelH relativeFrom="margin">
+                  <wp14:pctWidth>0</wp14:pctWidth>
+                </wp14:sizeRelH>
+                <wp14:sizeRelV relativeFrom="margin">
+                  <wp14:pctHeight>0</wp14:pctHeight>
+                </wp14:sizeRelV>
+              </wp:anchor>
+            </w:drawing>
+          </mc:Choice>
+          <mc:Fallback>
+            <w:pict>
+              <v:rect w14:anchorId="39039C83" id="Rectangle 24" o:spid="_x0000_s1030" style="position:absolute;margin-left:-27.75pt;margin-top:394.55pt;width:72.75pt;height:61.5pt;z-index:251913728;visibility:visible;mso-wrap-style:square;mso-width-percent:0;mso-height-percent:0;mso-wrap-distance-left:9pt;mso-wrap-distance-top:0;mso-wrap-distance-right:9pt;mso-wrap-distance-bottom:0;mso-position-horizontal:absolute;mso-position-horizontal-relative:text;mso-position-vertical:absolute;mso-position-vertical-relative:text;mso-width-percent:0;mso-height-percent:0;mso-width-relative:margin;mso-height-relative:margin;v-text-anchor:middle" o:gfxdata="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" fillcolor="#5a5a5a [2109]" strokecolor="#0a121c [484]" strokeweight="2pt">
+                <v:textbox>
+                  <w:txbxContent>
+                    <w:p>
+                      <w:pPr>
+                        <w:jc w:val="center"/>
+                        <w:rPr>
+                          <w:sz w:val="26"/>
+                          <w:szCs w:val="26"/>
+                        </w:rPr>
+                      </w:pPr>
+                      <w:r>
+                        <w:rPr>
+                          <w:sz w:val="26"/>
+                          <w:szCs w:val="26"/>
+                        </w:rPr>
+                        <w:t>Data Analysis</w:t>
+                      </w:r>
+                    </w:p>
+                  </w:txbxContent>
+                </v:textbox>
+              </v:rect>
+            </w:pict>
+          </mc:Fallback>
+        </mc:AlternateContent>
+      </w:r>
+      <w:r>
+        <w:rPr>
+          <w:noProof/>
+        </w:rPr>
+        <mc:AlternateContent>
+          <mc:Choice Requires="wps">
+            <w:drawing>
+              <wp:anchor distT="0" distB="0" distL="114300" distR="114300" simplePos="0" relativeHeight="251993600" behindDoc="0" locked="0" layoutInCell="1" allowOverlap="1" wp14:anchorId="2F7C58F6" wp14:editId="7F1569CB">
+                <wp:simplePos x="0" y="0"/>
+                <wp:positionH relativeFrom="column">
+                  <wp:posOffset>676275</wp:posOffset>
+                </wp:positionH>
+                <wp:positionV relativeFrom="paragraph">
+                  <wp:posOffset>5277485</wp:posOffset>
+                </wp:positionV>
+                <wp:extent cx="314325" cy="266700"/>
+                <wp:effectExtent l="19050" t="19050" r="28575" b="38100"/>
+                <wp:wrapNone/>
+                <wp:docPr id="27" name="Arrow: Right 27"/>
+                <wp:cNvGraphicFramePr/>
+                <a:graphic xmlns:a="http://schemas.openxmlformats.org/drawingml/2006/main">
+                  <a:graphicData uri="http://schemas.microsoft.com/office/word/2010/wordprocessingShape">
+                    <wps:wsp>
+                      <wps:cNvSpPr/>
+                      <wps:spPr>
+                        <a:xfrm rot="10800000">
+                          <a:off x="0" y="0"/>
+                          <a:ext cx="314325" cy="266700"/>
                         </a:xfrm>
                         <a:prstGeom prst="rightArrow">
                           <a:avLst/>
@@ -402,12 +1465,18 @@
                     </wps:wsp>
                   </a:graphicData>
                 </a:graphic>
+                <wp14:sizeRelH relativeFrom="margin">
+                  <wp14:pctWidth>0</wp14:pctWidth>
+                </wp14:sizeRelH>
+                <wp14:sizeRelV relativeFrom="margin">
+                  <wp14:pctHeight>0</wp14:pctHeight>
+                </wp14:sizeRelV>
               </wp:anchor>
             </w:drawing>
           </mc:Choice>
           <mc:Fallback>
             <w:pict>
-              <v:shape w14:anchorId="132B9061" id="Arrow: Right 8" o:spid="_x0000_s1026" type="#_x0000_t13" style="position:absolute;margin-left:338.45pt;margin-top:31.15pt;width:20.1pt;height:22.6pt;z-index:251696640;visibility:visible;mso-wrap-style:square;mso-wrap-distance-left:9pt;mso-wrap-distance-top:0;mso-wrap-distance-right:9pt;mso-wrap-distance-bottom:0;mso-position-horizontal:absolute;mso-position-horizontal-relative:text;mso-position-vertical:absolute;mso-position-vertical-relative:text;v-text-anchor:middle" o:gfxdata="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" adj="10800" fillcolor="#5a5a5a [2109]" strokecolor="#0a121c [484]" strokeweight="2pt"/>
+              <v:shape w14:anchorId="345F78AE" id="Arrow: Right 27" o:spid="_x0000_s1026" type="#_x0000_t13" style="position:absolute;margin-left:53.25pt;margin-top:415.55pt;width:24.75pt;height:21pt;rotation:180;z-index:251993600;visibility:visible;mso-wrap-style:square;mso-width-percent:0;mso-height-percent:0;mso-wrap-distance-left:9pt;mso-wrap-distance-top:0;mso-wrap-distance-right:9pt;mso-wrap-distance-bottom:0;mso-position-horizontal:absolute;mso-position-horizontal-relative:text;mso-position-vertical:absolute;mso-position-vertical-relative:text;mso-width-percent:0;mso-height-percent:0;mso-width-relative:margin;mso-height-relative:margin;v-text-anchor:middle" o:gfxdata="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" adj="12436" fillcolor="#5a5a5a [2109]" strokecolor="#0a121c [484]" strokeweight="2pt"/>
             </w:pict>
           </mc:Fallback>
         </mc:AlternateContent>
@@ -419,18 +1488,18 @@
         <mc:AlternateContent>
           <mc:Choice Requires="wps">
             <w:drawing>
-              <wp:anchor distT="0" distB="0" distL="114300" distR="114300" simplePos="0" relativeHeight="251698688" behindDoc="0" locked="0" layoutInCell="1" allowOverlap="1" wp14:anchorId="6449BF4D" wp14:editId="396ECDD6">
+              <wp:anchor distT="0" distB="0" distL="114300" distR="114300" simplePos="0" relativeHeight="251942400" behindDoc="0" locked="0" layoutInCell="1" allowOverlap="1" wp14:anchorId="527B743B" wp14:editId="54653422">
                 <wp:simplePos x="0" y="0"/>
                 <wp:positionH relativeFrom="column">
-                  <wp:posOffset>1778974</wp:posOffset>
+                  <wp:posOffset>1114425</wp:posOffset>
                 </wp:positionH>
                 <wp:positionV relativeFrom="paragraph">
-                  <wp:posOffset>395620</wp:posOffset>
+                  <wp:posOffset>5019675</wp:posOffset>
                 </wp:positionV>
-                <wp:extent cx="255182" cy="287079"/>
-                <wp:effectExtent l="0" t="19050" r="31115" b="36830"/>
+                <wp:extent cx="1143000" cy="790575"/>
+                <wp:effectExtent l="0" t="0" r="19050" b="28575"/>
                 <wp:wrapNone/>
-                <wp:docPr id="9" name="Arrow: Right 9"/>
+                <wp:docPr id="25" name="Rectangle 25"/>
                 <wp:cNvGraphicFramePr/>
                 <a:graphic xmlns:a="http://schemas.openxmlformats.org/drawingml/2006/main">
                   <a:graphicData uri="http://schemas.microsoft.com/office/word/2010/wordprocessingShape">
@@ -439,7 +1508,184 @@
                       <wps:spPr>
                         <a:xfrm>
                           <a:off x="0" y="0"/>
-                          <a:ext cx="255182" cy="287079"/>
+                          <a:ext cx="1143000" cy="790575"/>
+                        </a:xfrm>
+                        <a:prstGeom prst="rect">
+                          <a:avLst/>
+                        </a:prstGeom>
+                        <a:solidFill>
+                          <a:schemeClr val="tx1">
+                            <a:lumMod val="65000"/>
+                            <a:lumOff val="35000"/>
+                          </a:schemeClr>
+                        </a:solidFill>
+                      </wps:spPr>
+                      <wps:style>
+                        <a:lnRef idx="2">
+                          <a:schemeClr val="accent1">
+                            <a:shade val="15000"/>
+                          </a:schemeClr>
+                        </a:lnRef>
+                        <a:fillRef idx="1">
+                          <a:schemeClr val="accent1"/>
+                        </a:fillRef>
+                        <a:effectRef idx="0">
+                          <a:schemeClr val="accent1"/>
+                        </a:effectRef>
+                        <a:fontRef idx="minor">
+                          <a:schemeClr val="lt1"/>
+                        </a:fontRef>
+                      </wps:style>
+                      <wps:txbx>
+                        <w:txbxContent>
+                          <w:p>
+                            <w:pPr>
+                              <w:jc w:val="center"/>
+                              <w:rPr>
+                                <w:sz w:val="40"/>
+                                <w:szCs w:val="40"/>
+                              </w:rPr>
+                            </w:pPr>
+                            <w:r>
+                              <w:rPr>
+                                <w:sz w:val="26"/>
+                                <w:szCs w:val="26"/>
+                              </w:rPr>
+                              <w:t>Real-Time</w:t>
+                            </w:r>
+                            <w:r>
+                              <w:rPr>
+                                <w:sz w:val="26"/>
+                                <w:szCs w:val="26"/>
+                              </w:rPr>
+                              <w:t xml:space="preserve"> </w:t>
+                            </w:r>
+                            <w:r>
+                              <w:rPr>
+                                <w:sz w:val="26"/>
+                                <w:szCs w:val="26"/>
+                              </w:rPr>
+                              <w:t>Data</w:t>
+                            </w:r>
+                            <w:r>
+                              <w:rPr>
+                                <w:sz w:val="26"/>
+                                <w:szCs w:val="26"/>
+                              </w:rPr>
+                              <w:t xml:space="preserve"> </w:t>
+                            </w:r>
+                            <w:r>
+                              <w:rPr>
+                                <w:sz w:val="26"/>
+                                <w:szCs w:val="26"/>
+                              </w:rPr>
+                              <w:t>Extraction</w:t>
+                            </w:r>
+                          </w:p>
+                        </w:txbxContent>
+                      </wps:txbx>
+                      <wps:bodyPr rot="0" spcFirstLastPara="0" vertOverflow="overflow" horzOverflow="overflow" vert="horz" wrap="square" lIns="91440" tIns="45720" rIns="91440" bIns="45720" numCol="1" spcCol="0" rtlCol="0" fromWordArt="0" anchor="ctr" anchorCtr="0" forceAA="0" compatLnSpc="1">
+                        <a:prstTxWarp prst="textNoShape">
+                          <a:avLst/>
+                        </a:prstTxWarp>
+                        <a:noAutofit/>
+                      </wps:bodyPr>
+                    </wps:wsp>
+                  </a:graphicData>
+                </a:graphic>
+                <wp14:sizeRelH relativeFrom="margin">
+                  <wp14:pctWidth>0</wp14:pctWidth>
+                </wp14:sizeRelH>
+                <wp14:sizeRelV relativeFrom="margin">
+                  <wp14:pctHeight>0</wp14:pctHeight>
+                </wp14:sizeRelV>
+              </wp:anchor>
+            </w:drawing>
+          </mc:Choice>
+          <mc:Fallback>
+            <w:pict>
+              <v:rect w14:anchorId="527B743B" id="Rectangle 25" o:spid="_x0000_s1031" style="position:absolute;margin-left:87.75pt;margin-top:395.25pt;width:90pt;height:62.25pt;z-index:251942400;visibility:visible;mso-wrap-style:square;mso-width-percent:0;mso-height-percent:0;mso-wrap-distance-left:9pt;mso-wrap-distance-top:0;mso-wrap-distance-right:9pt;mso-wrap-distance-bottom:0;mso-position-horizontal:absolute;mso-position-horizontal-relative:text;mso-position-vertical:absolute;mso-position-vertical-relative:text;mso-width-percent:0;mso-height-percent:0;mso-width-relative:margin;mso-height-relative:margin;v-text-anchor:middle" o:gfxdata="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" fillcolor="#5a5a5a [2109]" strokecolor="#0a121c [484]" strokeweight="2pt">
+                <v:textbox>
+                  <w:txbxContent>
+                    <w:p>
+                      <w:pPr>
+                        <w:jc w:val="center"/>
+                        <w:rPr>
+                          <w:sz w:val="40"/>
+                          <w:szCs w:val="40"/>
+                        </w:rPr>
+                      </w:pPr>
+                      <w:r>
+                        <w:rPr>
+                          <w:sz w:val="26"/>
+                          <w:szCs w:val="26"/>
+                        </w:rPr>
+                        <w:t>Real-Time</w:t>
+                      </w:r>
+                      <w:r>
+                        <w:rPr>
+                          <w:sz w:val="26"/>
+                          <w:szCs w:val="26"/>
+                        </w:rPr>
+                        <w:t xml:space="preserve"> </w:t>
+                      </w:r>
+                      <w:r>
+                        <w:rPr>
+                          <w:sz w:val="26"/>
+                          <w:szCs w:val="26"/>
+                        </w:rPr>
+                        <w:t>Data</w:t>
+                      </w:r>
+                      <w:r>
+                        <w:rPr>
+                          <w:sz w:val="26"/>
+                          <w:szCs w:val="26"/>
+                        </w:rPr>
+                        <w:t xml:space="preserve"> </w:t>
+                      </w:r>
+                      <w:r>
+                        <w:rPr>
+                          <w:sz w:val="26"/>
+                          <w:szCs w:val="26"/>
+                        </w:rPr>
+                        <w:t>Extraction</w:t>
+                      </w:r>
+                    </w:p>
+                  </w:txbxContent>
+                </v:textbox>
+              </v:rect>
+            </w:pict>
+          </mc:Fallback>
+        </mc:AlternateContent>
+      </w:r>
+      <w:r>
+        <w:rPr>
+          <w:noProof/>
+        </w:rPr>
+        <mc:AlternateContent>
+          <mc:Choice Requires="wps">
+            <w:drawing>
+              <wp:anchor distT="0" distB="0" distL="114300" distR="114300" simplePos="0" relativeHeight="252012032" behindDoc="0" locked="0" layoutInCell="1" allowOverlap="1" wp14:anchorId="30F1A3D2" wp14:editId="5A116C07">
+                <wp:simplePos x="0" y="0"/>
+                <wp:positionH relativeFrom="column">
+                  <wp:posOffset>2352675</wp:posOffset>
+                </wp:positionH>
+                <wp:positionV relativeFrom="paragraph">
+                  <wp:posOffset>5277485</wp:posOffset>
+                </wp:positionV>
+                <wp:extent cx="314325" cy="266700"/>
+                <wp:effectExtent l="19050" t="19050" r="28575" b="38100"/>
+                <wp:wrapNone/>
+                <wp:docPr id="28" name="Arrow: Right 28"/>
+                <wp:cNvGraphicFramePr/>
+                <a:graphic xmlns:a="http://schemas.openxmlformats.org/drawingml/2006/main">
+                  <a:graphicData uri="http://schemas.microsoft.com/office/word/2010/wordprocessingShape">
+                    <wps:wsp>
+                      <wps:cNvSpPr/>
+                      <wps:spPr>
+                        <a:xfrm rot="10800000">
+                          <a:off x="0" y="0"/>
+                          <a:ext cx="314325" cy="266700"/>
                         </a:xfrm>
                         <a:prstGeom prst="rightArrow">
                           <a:avLst/>
@@ -476,12 +1722,18 @@
                     </wps:wsp>
                   </a:graphicData>
                 </a:graphic>
+                <wp14:sizeRelH relativeFrom="margin">
+                  <wp14:pctWidth>0</wp14:pctWidth>
+                </wp14:sizeRelH>
+                <wp14:sizeRelV relativeFrom="margin">
+                  <wp14:pctHeight>0</wp14:pctHeight>
+                </wp14:sizeRelV>
               </wp:anchor>
             </w:drawing>
           </mc:Choice>
           <mc:Fallback>
             <w:pict>
-              <v:shape w14:anchorId="0E1C9E8F" id="Arrow: Right 9" o:spid="_x0000_s1026" type="#_x0000_t13" style="position:absolute;margin-left:140.1pt;margin-top:31.15pt;width:20.1pt;height:22.6pt;z-index:251698688;visibility:visible;mso-wrap-style:square;mso-wrap-distance-left:9pt;mso-wrap-distance-top:0;mso-wrap-distance-right:9pt;mso-wrap-distance-bottom:0;mso-position-horizontal:absolute;mso-position-horizontal-relative:text;mso-position-vertical:absolute;mso-position-vertical-relative:text;v-text-anchor:middle" o:gfxdata="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" adj="10800" fillcolor="#5a5a5a [2109]" strokecolor="#0a121c [484]" strokeweight="2pt"/>
+              <v:shape w14:anchorId="3B925526" id="Arrow: Right 28" o:spid="_x0000_s1026" type="#_x0000_t13" style="position:absolute;margin-left:185.25pt;margin-top:415.55pt;width:24.75pt;height:21pt;rotation:180;z-index:252012032;visibility:visible;mso-wrap-style:square;mso-width-percent:0;mso-height-percent:0;mso-wrap-distance-left:9pt;mso-wrap-distance-top:0;mso-wrap-distance-right:9pt;mso-wrap-distance-bottom:0;mso-position-horizontal:absolute;mso-position-horizontal-relative:text;mso-position-vertical:absolute;mso-position-vertical-relative:text;mso-width-percent:0;mso-height-percent:0;mso-width-relative:margin;mso-height-relative:margin;v-text-anchor:middle" o:gfxdata="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" adj="12436" fillcolor="#5a5a5a [2109]" strokecolor="#0a121c [484]" strokeweight="2pt"/>
             </w:pict>
           </mc:Fallback>
         </mc:AlternateContent>
@@ -493,13 +1745,355 @@
         <mc:AlternateContent>
           <mc:Choice Requires="wps">
             <w:drawing>
-              <wp:anchor distT="0" distB="0" distL="114300" distR="114300" simplePos="0" relativeHeight="251652608" behindDoc="0" locked="0" layoutInCell="1" allowOverlap="1" wp14:anchorId="25EF798B" wp14:editId="44A86156">
+              <wp:anchor distT="0" distB="0" distL="114300" distR="114300" simplePos="0" relativeHeight="251974144" behindDoc="0" locked="0" layoutInCell="1" allowOverlap="1" wp14:anchorId="2274514F" wp14:editId="4CFF4356">
                 <wp:simplePos x="0" y="0"/>
                 <wp:positionH relativeFrom="column">
-                  <wp:posOffset>2139315</wp:posOffset>
+                  <wp:posOffset>2754630</wp:posOffset>
                 </wp:positionH>
                 <wp:positionV relativeFrom="paragraph">
-                  <wp:posOffset>78105</wp:posOffset>
+                  <wp:posOffset>5001260</wp:posOffset>
+                </wp:positionV>
+                <wp:extent cx="1276350" cy="762000"/>
+                <wp:effectExtent l="0" t="0" r="19050" b="19050"/>
+                <wp:wrapNone/>
+                <wp:docPr id="26" name="Rectangle 26"/>
+                <wp:cNvGraphicFramePr/>
+                <a:graphic xmlns:a="http://schemas.openxmlformats.org/drawingml/2006/main">
+                  <a:graphicData uri="http://schemas.microsoft.com/office/word/2010/wordprocessingShape">
+                    <wps:wsp>
+                      <wps:cNvSpPr/>
+                      <wps:spPr>
+                        <a:xfrm>
+                          <a:off x="0" y="0"/>
+                          <a:ext cx="1276350" cy="762000"/>
+                        </a:xfrm>
+                        <a:prstGeom prst="rect">
+                          <a:avLst/>
+                        </a:prstGeom>
+                        <a:solidFill>
+                          <a:schemeClr val="tx1">
+                            <a:lumMod val="65000"/>
+                            <a:lumOff val="35000"/>
+                          </a:schemeClr>
+                        </a:solidFill>
+                      </wps:spPr>
+                      <wps:style>
+                        <a:lnRef idx="2">
+                          <a:schemeClr val="accent1">
+                            <a:shade val="15000"/>
+                          </a:schemeClr>
+                        </a:lnRef>
+                        <a:fillRef idx="1">
+                          <a:schemeClr val="accent1"/>
+                        </a:fillRef>
+                        <a:effectRef idx="0">
+                          <a:schemeClr val="accent1"/>
+                        </a:effectRef>
+                        <a:fontRef idx="minor">
+                          <a:schemeClr val="lt1"/>
+                        </a:fontRef>
+                      </wps:style>
+                      <wps:txbx>
+                        <w:txbxContent>
+                          <w:p>
+                            <w:pPr>
+                              <w:jc w:val="center"/>
+                              <w:rPr>
+                                <w:sz w:val="26"/>
+                                <w:szCs w:val="26"/>
+                              </w:rPr>
+                            </w:pPr>
+                            <w:r>
+                              <w:rPr>
+                                <w:sz w:val="26"/>
+                                <w:szCs w:val="26"/>
+                              </w:rPr>
+                              <w:t>Simulation</w:t>
+                            </w:r>
+                            <w:r>
+                              <w:rPr>
+                                <w:sz w:val="26"/>
+                                <w:szCs w:val="26"/>
+                              </w:rPr>
+                              <w:t xml:space="preserve"> </w:t>
+                            </w:r>
+                            <w:r>
+                              <w:rPr>
+                                <w:sz w:val="26"/>
+                                <w:szCs w:val="26"/>
+                              </w:rPr>
+                              <w:t>Execution</w:t>
+                            </w:r>
+                            <w:r>
+                              <w:rPr>
+                                <w:sz w:val="26"/>
+                                <w:szCs w:val="26"/>
+                              </w:rPr>
+                              <w:t xml:space="preserve"> </w:t>
+                            </w:r>
+                            <w:r>
+                              <w:rPr>
+                                <w:sz w:val="26"/>
+                                <w:szCs w:val="26"/>
+                              </w:rPr>
+                              <w:t>with</w:t>
+                            </w:r>
+                            <w:r>
+                              <w:rPr>
+                                <w:sz w:val="26"/>
+                                <w:szCs w:val="26"/>
+                              </w:rPr>
+                              <w:t xml:space="preserve"> </w:t>
+                            </w:r>
+                            <w:proofErr w:type="spellStart"/>
+                            <w:r>
+                              <w:rPr>
+                                <w:sz w:val="26"/>
+                                <w:szCs w:val="26"/>
+                              </w:rPr>
+                              <w:t>TraCI</w:t>
+                            </w:r>
+                            <w:proofErr w:type="spellEnd"/>
+                          </w:p>
+                          <w:p>
+                            <w:pPr>
+                              <w:jc w:val="center"/>
+                              <w:rPr>
+                                <w:sz w:val="40"/>
+                                <w:szCs w:val="40"/>
+                              </w:rPr>
+                            </w:pPr>
+                          </w:p>
+                        </w:txbxContent>
+                      </wps:txbx>
+                      <wps:bodyPr rot="0" spcFirstLastPara="0" vertOverflow="overflow" horzOverflow="overflow" vert="horz" wrap="square" lIns="91440" tIns="45720" rIns="91440" bIns="45720" numCol="1" spcCol="0" rtlCol="0" fromWordArt="0" anchor="ctr" anchorCtr="0" forceAA="0" compatLnSpc="1">
+                        <a:prstTxWarp prst="textNoShape">
+                          <a:avLst/>
+                        </a:prstTxWarp>
+                        <a:noAutofit/>
+                      </wps:bodyPr>
+                    </wps:wsp>
+                  </a:graphicData>
+                </a:graphic>
+                <wp14:sizeRelH relativeFrom="margin">
+                  <wp14:pctWidth>0</wp14:pctWidth>
+                </wp14:sizeRelH>
+                <wp14:sizeRelV relativeFrom="margin">
+                  <wp14:pctHeight>0</wp14:pctHeight>
+                </wp14:sizeRelV>
+              </wp:anchor>
+            </w:drawing>
+          </mc:Choice>
+          <mc:Fallback>
+            <w:pict>
+              <v:rect w14:anchorId="2274514F" id="Rectangle 26" o:spid="_x0000_s1032" style="position:absolute;margin-left:216.9pt;margin-top:393.8pt;width:100.5pt;height:60pt;z-index:251974144;visibility:visible;mso-wrap-style:square;mso-width-percent:0;mso-height-percent:0;mso-wrap-distance-left:9pt;mso-wrap-distance-top:0;mso-wrap-distance-right:9pt;mso-wrap-distance-bottom:0;mso-position-horizontal:absolute;mso-position-horizontal-relative:text;mso-position-vertical:absolute;mso-position-vertical-relative:text;mso-width-percent:0;mso-height-percent:0;mso-width-relative:margin;mso-height-relative:margin;v-text-anchor:middle" o:gfxdata="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" fillcolor="#5a5a5a [2109]" strokecolor="#0a121c [484]" strokeweight="2pt">
+                <v:textbox>
+                  <w:txbxContent>
+                    <w:p>
+                      <w:pPr>
+                        <w:jc w:val="center"/>
+                        <w:rPr>
+                          <w:sz w:val="26"/>
+                          <w:szCs w:val="26"/>
+                        </w:rPr>
+                      </w:pPr>
+                      <w:r>
+                        <w:rPr>
+                          <w:sz w:val="26"/>
+                          <w:szCs w:val="26"/>
+                        </w:rPr>
+                        <w:t>Simulation</w:t>
+                      </w:r>
+                      <w:r>
+                        <w:rPr>
+                          <w:sz w:val="26"/>
+                          <w:szCs w:val="26"/>
+                        </w:rPr>
+                        <w:t xml:space="preserve"> </w:t>
+                      </w:r>
+                      <w:r>
+                        <w:rPr>
+                          <w:sz w:val="26"/>
+                          <w:szCs w:val="26"/>
+                        </w:rPr>
+                        <w:t>Execution</w:t>
+                      </w:r>
+                      <w:r>
+                        <w:rPr>
+                          <w:sz w:val="26"/>
+                          <w:szCs w:val="26"/>
+                        </w:rPr>
+                        <w:t xml:space="preserve"> </w:t>
+                      </w:r>
+                      <w:r>
+                        <w:rPr>
+                          <w:sz w:val="26"/>
+                          <w:szCs w:val="26"/>
+                        </w:rPr>
+                        <w:t>with</w:t>
+                      </w:r>
+                      <w:r>
+                        <w:rPr>
+                          <w:sz w:val="26"/>
+                          <w:szCs w:val="26"/>
+                        </w:rPr>
+                        <w:t xml:space="preserve"> </w:t>
+                      </w:r>
+                      <w:proofErr w:type="spellStart"/>
+                      <w:r>
+                        <w:rPr>
+                          <w:sz w:val="26"/>
+                          <w:szCs w:val="26"/>
+                        </w:rPr>
+                        <w:t>TraCI</w:t>
+                      </w:r>
+                      <w:proofErr w:type="spellEnd"/>
+                    </w:p>
+                    <w:p>
+                      <w:pPr>
+                        <w:jc w:val="center"/>
+                        <w:rPr>
+                          <w:sz w:val="40"/>
+                          <w:szCs w:val="40"/>
+                        </w:rPr>
+                      </w:pPr>
+                    </w:p>
+                  </w:txbxContent>
+                </v:textbox>
+              </v:rect>
+            </w:pict>
+          </mc:Fallback>
+        </mc:AlternateContent>
+      </w:r>
+      <w:r>
+        <w:rPr>
+          <w:noProof/>
+        </w:rPr>
+        <mc:AlternateContent>
+          <mc:Choice Requires="wps">
+            <w:drawing>
+              <wp:anchor distT="0" distB="0" distL="114300" distR="114300" simplePos="0" relativeHeight="251491840" behindDoc="0" locked="0" layoutInCell="1" allowOverlap="1" wp14:anchorId="0720A737" wp14:editId="21DEE9DC">
+                <wp:simplePos x="0" y="0"/>
+                <wp:positionH relativeFrom="column">
+                  <wp:posOffset>1924685</wp:posOffset>
+                </wp:positionH>
+                <wp:positionV relativeFrom="paragraph">
+                  <wp:posOffset>6985000</wp:posOffset>
+                </wp:positionV>
+                <wp:extent cx="2073349" cy="861238"/>
+                <wp:effectExtent l="0" t="0" r="22225" b="15240"/>
+                <wp:wrapNone/>
+                <wp:docPr id="5" name="Rectangle 5"/>
+                <wp:cNvGraphicFramePr/>
+                <a:graphic xmlns:a="http://schemas.openxmlformats.org/drawingml/2006/main">
+                  <a:graphicData uri="http://schemas.microsoft.com/office/word/2010/wordprocessingShape">
+                    <wps:wsp>
+                      <wps:cNvSpPr/>
+                      <wps:spPr>
+                        <a:xfrm>
+                          <a:off x="0" y="0"/>
+                          <a:ext cx="2073349" cy="861238"/>
+                        </a:xfrm>
+                        <a:prstGeom prst="rect">
+                          <a:avLst/>
+                        </a:prstGeom>
+                        <a:solidFill>
+                          <a:schemeClr val="tx1">
+                            <a:lumMod val="65000"/>
+                            <a:lumOff val="35000"/>
+                          </a:schemeClr>
+                        </a:solidFill>
+                      </wps:spPr>
+                      <wps:style>
+                        <a:lnRef idx="2">
+                          <a:schemeClr val="accent1">
+                            <a:shade val="15000"/>
+                          </a:schemeClr>
+                        </a:lnRef>
+                        <a:fillRef idx="1">
+                          <a:schemeClr val="accent1"/>
+                        </a:fillRef>
+                        <a:effectRef idx="0">
+                          <a:schemeClr val="accent1"/>
+                        </a:effectRef>
+                        <a:fontRef idx="minor">
+                          <a:schemeClr val="lt1"/>
+                        </a:fontRef>
+                      </wps:style>
+                      <wps:txbx>
+                        <w:txbxContent>
+                          <w:p>
+                            <w:pPr>
+                              <w:jc w:val="center"/>
+                              <w:rPr>
+                                <w:sz w:val="40"/>
+                                <w:szCs w:val="40"/>
+                              </w:rPr>
+                            </w:pPr>
+                            <w:r>
+                              <w:rPr>
+                                <w:sz w:val="40"/>
+                                <w:szCs w:val="40"/>
+                              </w:rPr>
+                              <w:t>Dataset Preprocessing</w:t>
+                            </w:r>
+                          </w:p>
+                        </w:txbxContent>
+                      </wps:txbx>
+                      <wps:bodyPr rot="0" spcFirstLastPara="0" vertOverflow="overflow" horzOverflow="overflow" vert="horz" wrap="square" lIns="91440" tIns="45720" rIns="91440" bIns="45720" numCol="1" spcCol="0" rtlCol="0" fromWordArt="0" anchor="ctr" anchorCtr="0" forceAA="0" compatLnSpc="1">
+                        <a:prstTxWarp prst="textNoShape">
+                          <a:avLst/>
+                        </a:prstTxWarp>
+                        <a:noAutofit/>
+                      </wps:bodyPr>
+                    </wps:wsp>
+                  </a:graphicData>
+                </a:graphic>
+              </wp:anchor>
+            </w:drawing>
+          </mc:Choice>
+          <mc:Fallback>
+            <w:pict>
+              <v:rect w14:anchorId="0720A737" id="Rectangle 5" o:spid="_x0000_s1033" style="position:absolute;margin-left:151.55pt;margin-top:550pt;width:163.25pt;height:67.8pt;z-index:251491840;visibility:visible;mso-wrap-style:square;mso-wrap-distance-left:9pt;mso-wrap-distance-top:0;mso-wrap-distance-right:9pt;mso-wrap-distance-bottom:0;mso-position-horizontal:absolute;mso-position-horizontal-relative:text;mso-position-vertical:absolute;mso-position-vertical-relative:text;v-text-anchor:middle" o:gfxdata="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" fillcolor="#5a5a5a [2109]" strokecolor="#0a121c [484]" strokeweight="2pt">
+                <v:textbox>
+                  <w:txbxContent>
+                    <w:p>
+                      <w:pPr>
+                        <w:jc w:val="center"/>
+                        <w:rPr>
+                          <w:sz w:val="40"/>
+                          <w:szCs w:val="40"/>
+                        </w:rPr>
+                      </w:pPr>
+                      <w:r>
+                        <w:rPr>
+                          <w:sz w:val="40"/>
+                          <w:szCs w:val="40"/>
+                        </w:rPr>
+                        <w:t>Dataset Preprocessing</w:t>
+                      </w:r>
+                    </w:p>
+                  </w:txbxContent>
+                </v:textbox>
+              </v:rect>
+            </w:pict>
+          </mc:Fallback>
+        </mc:AlternateContent>
+      </w:r>
+      <w:r>
+        <w:rPr>
+          <w:noProof/>
+        </w:rPr>
+        <mc:AlternateContent>
+          <mc:Choice Requires="wps">
+            <w:drawing>
+              <wp:anchor distT="0" distB="0" distL="114300" distR="114300" simplePos="0" relativeHeight="251420160" behindDoc="0" locked="0" layoutInCell="1" allowOverlap="1" wp14:anchorId="25EF798B" wp14:editId="79FC91D6">
+                <wp:simplePos x="0" y="0"/>
+                <wp:positionH relativeFrom="column">
+                  <wp:posOffset>4152900</wp:posOffset>
+                </wp:positionH>
+                <wp:positionV relativeFrom="paragraph">
+                  <wp:posOffset>6873875</wp:posOffset>
                 </wp:positionV>
                 <wp:extent cx="2073275" cy="861060"/>
                 <wp:effectExtent l="0" t="0" r="22225" b="15240"/>
@@ -589,7 +2183,7 @@
           </mc:Choice>
           <mc:Fallback>
             <w:pict>
-              <v:rect w14:anchorId="25EF798B" id="Rectangle 3" o:spid="_x0000_s1027" style="position:absolute;margin-left:168.45pt;margin-top:6.15pt;width:163.25pt;height:67.8pt;z-index:251652608;visibility:visible;mso-wrap-style:square;mso-wrap-distance-left:9pt;mso-wrap-distance-top:0;mso-wrap-distance-right:9pt;mso-wrap-distance-bottom:0;mso-position-horizontal:absolute;mso-position-horizontal-relative:text;mso-position-vertical:absolute;mso-position-vertical-relative:text;v-text-anchor:middle" o:gfxdata="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" fillcolor="#5a5a5a [2109]" strokecolor="#0a121c [484]" strokeweight="2pt">
+              <v:rect w14:anchorId="25EF798B" id="Rectangle 3" o:spid="_x0000_s1034" style="position:absolute;margin-left:327pt;margin-top:541.25pt;width:163.25pt;height:67.8pt;z-index:251420160;visibility:visible;mso-wrap-style:square;mso-wrap-distance-left:9pt;mso-wrap-distance-top:0;mso-wrap-distance-right:9pt;mso-wrap-distance-bottom:0;mso-position-horizontal:absolute;mso-position-horizontal-relative:text;mso-position-vertical:absolute;mso-position-vertical-relative:text;v-text-anchor:middle" o:gfxdata="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" fillcolor="#5a5a5a [2109]" strokecolor="#0a121c [484]" strokeweight="2pt">
                 <v:textbox>
                   <w:txbxContent>
                     <w:p>
@@ -636,13 +2230,1103 @@
         <mc:AlternateContent>
           <mc:Choice Requires="wps">
             <w:drawing>
-              <wp:anchor distT="0" distB="0" distL="114300" distR="114300" simplePos="0" relativeHeight="251665920" behindDoc="0" locked="0" layoutInCell="1" allowOverlap="1" wp14:anchorId="534345C8" wp14:editId="12E6C4A5">
+              <wp:anchor distT="0" distB="0" distL="114300" distR="114300" simplePos="0" relativeHeight="251865600" behindDoc="0" locked="0" layoutInCell="1" allowOverlap="1" wp14:anchorId="71278431" wp14:editId="5C910CDE">
                 <wp:simplePos x="0" y="0"/>
                 <wp:positionH relativeFrom="column">
-                  <wp:posOffset>650594</wp:posOffset>
+                  <wp:posOffset>5180965</wp:posOffset>
                 </wp:positionH>
                 <wp:positionV relativeFrom="paragraph">
-                  <wp:posOffset>1471605</wp:posOffset>
+                  <wp:posOffset>4620260</wp:posOffset>
+                </wp:positionV>
+                <wp:extent cx="293690" cy="264794"/>
+                <wp:effectExtent l="14605" t="4445" r="45085" b="45085"/>
+                <wp:wrapNone/>
+                <wp:docPr id="22" name="Arrow: Right 22"/>
+                <wp:cNvGraphicFramePr/>
+                <a:graphic xmlns:a="http://schemas.openxmlformats.org/drawingml/2006/main">
+                  <a:graphicData uri="http://schemas.microsoft.com/office/word/2010/wordprocessingShape">
+                    <wps:wsp>
+                      <wps:cNvSpPr/>
+                      <wps:spPr>
+                        <a:xfrm rot="5400000">
+                          <a:off x="0" y="0"/>
+                          <a:ext cx="293690" cy="264794"/>
+                        </a:xfrm>
+                        <a:prstGeom prst="rightArrow">
+                          <a:avLst/>
+                        </a:prstGeom>
+                        <a:solidFill>
+                          <a:schemeClr val="tx1">
+                            <a:lumMod val="65000"/>
+                            <a:lumOff val="35000"/>
+                          </a:schemeClr>
+                        </a:solidFill>
+                      </wps:spPr>
+                      <wps:style>
+                        <a:lnRef idx="2">
+                          <a:schemeClr val="accent1">
+                            <a:shade val="15000"/>
+                          </a:schemeClr>
+                        </a:lnRef>
+                        <a:fillRef idx="1">
+                          <a:schemeClr val="accent1"/>
+                        </a:fillRef>
+                        <a:effectRef idx="0">
+                          <a:schemeClr val="accent1"/>
+                        </a:effectRef>
+                        <a:fontRef idx="minor">
+                          <a:schemeClr val="lt1"/>
+                        </a:fontRef>
+                      </wps:style>
+                      <wps:bodyPr rot="0" spcFirstLastPara="0" vertOverflow="overflow" horzOverflow="overflow" vert="horz" wrap="square" lIns="91440" tIns="45720" rIns="91440" bIns="45720" numCol="1" spcCol="0" rtlCol="0" fromWordArt="0" anchor="ctr" anchorCtr="0" forceAA="0" compatLnSpc="1">
+                        <a:prstTxWarp prst="textNoShape">
+                          <a:avLst/>
+                        </a:prstTxWarp>
+                        <a:noAutofit/>
+                      </wps:bodyPr>
+                    </wps:wsp>
+                  </a:graphicData>
+                </a:graphic>
+                <wp14:sizeRelH relativeFrom="margin">
+                  <wp14:pctWidth>0</wp14:pctWidth>
+                </wp14:sizeRelH>
+                <wp14:sizeRelV relativeFrom="margin">
+                  <wp14:pctHeight>0</wp14:pctHeight>
+                </wp14:sizeRelV>
+              </wp:anchor>
+            </w:drawing>
+          </mc:Choice>
+          <mc:Fallback>
+            <w:pict>
+              <v:shape w14:anchorId="2F4F8D56" id="Arrow: Right 22" o:spid="_x0000_s1026" type="#_x0000_t13" style="position:absolute;margin-left:407.95pt;margin-top:363.8pt;width:23.15pt;height:20.85pt;rotation:90;z-index:251865600;visibility:visible;mso-wrap-style:square;mso-width-percent:0;mso-height-percent:0;mso-wrap-distance-left:9pt;mso-wrap-distance-top:0;mso-wrap-distance-right:9pt;mso-wrap-distance-bottom:0;mso-position-horizontal:absolute;mso-position-horizontal-relative:text;mso-position-vertical:absolute;mso-position-vertical-relative:text;mso-width-percent:0;mso-height-percent:0;mso-width-relative:margin;mso-height-relative:margin;v-text-anchor:middle" o:gfxdata="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" adj="11863" fillcolor="#5a5a5a [2109]" strokecolor="#0a121c [484]" strokeweight="2pt"/>
+            </w:pict>
+          </mc:Fallback>
+        </mc:AlternateContent>
+      </w:r>
+      <w:r>
+        <w:rPr>
+          <w:noProof/>
+        </w:rPr>
+        <mc:AlternateContent>
+          <mc:Choice Requires="wps">
+            <w:drawing>
+              <wp:anchor distT="0" distB="0" distL="114300" distR="114300" simplePos="0" relativeHeight="251808256" behindDoc="0" locked="0" layoutInCell="1" allowOverlap="1" wp14:anchorId="63770F52" wp14:editId="44BDA350">
+                <wp:simplePos x="0" y="0"/>
+                <wp:positionH relativeFrom="column">
+                  <wp:posOffset>4648200</wp:posOffset>
+                </wp:positionH>
+                <wp:positionV relativeFrom="paragraph">
+                  <wp:posOffset>3724910</wp:posOffset>
+                </wp:positionV>
+                <wp:extent cx="1276350" cy="790575"/>
+                <wp:effectExtent l="0" t="0" r="19050" b="28575"/>
+                <wp:wrapNone/>
+                <wp:docPr id="19" name="Rectangle 19"/>
+                <wp:cNvGraphicFramePr/>
+                <a:graphic xmlns:a="http://schemas.openxmlformats.org/drawingml/2006/main">
+                  <a:graphicData uri="http://schemas.microsoft.com/office/word/2010/wordprocessingShape">
+                    <wps:wsp>
+                      <wps:cNvSpPr/>
+                      <wps:spPr>
+                        <a:xfrm>
+                          <a:off x="0" y="0"/>
+                          <a:ext cx="1276350" cy="790575"/>
+                        </a:xfrm>
+                        <a:prstGeom prst="rect">
+                          <a:avLst/>
+                        </a:prstGeom>
+                        <a:solidFill>
+                          <a:schemeClr val="tx1">
+                            <a:lumMod val="65000"/>
+                            <a:lumOff val="35000"/>
+                          </a:schemeClr>
+                        </a:solidFill>
+                      </wps:spPr>
+                      <wps:style>
+                        <a:lnRef idx="2">
+                          <a:schemeClr val="accent1">
+                            <a:shade val="15000"/>
+                          </a:schemeClr>
+                        </a:lnRef>
+                        <a:fillRef idx="1">
+                          <a:schemeClr val="accent1"/>
+                        </a:fillRef>
+                        <a:effectRef idx="0">
+                          <a:schemeClr val="accent1"/>
+                        </a:effectRef>
+                        <a:fontRef idx="minor">
+                          <a:schemeClr val="lt1"/>
+                        </a:fontRef>
+                      </wps:style>
+                      <wps:txbx>
+                        <w:txbxContent>
+                          <w:p>
+                            <w:pPr>
+                              <w:jc w:val="center"/>
+                              <w:rPr>
+                                <w:sz w:val="26"/>
+                                <w:szCs w:val="26"/>
+                              </w:rPr>
+                            </w:pPr>
+                            <w:r>
+                              <w:rPr>
+                                <w:sz w:val="26"/>
+                                <w:szCs w:val="26"/>
+                              </w:rPr>
+                              <w:t xml:space="preserve">Route Creation &amp; </w:t>
+                            </w:r>
+                            <w:r>
+                              <w:rPr>
+                                <w:sz w:val="26"/>
+                                <w:szCs w:val="26"/>
+                              </w:rPr>
+                              <w:t>Vehicle</w:t>
+                            </w:r>
+                            <w:r>
+                              <w:rPr>
+                                <w:sz w:val="26"/>
+                                <w:szCs w:val="26"/>
+                              </w:rPr>
+                              <w:t xml:space="preserve"> </w:t>
+                            </w:r>
+                            <w:r>
+                              <w:rPr>
+                                <w:sz w:val="26"/>
+                                <w:szCs w:val="26"/>
+                              </w:rPr>
+                              <w:t>Fleet</w:t>
+                            </w:r>
+                            <w:r>
+                              <w:rPr>
+                                <w:sz w:val="26"/>
+                                <w:szCs w:val="26"/>
+                              </w:rPr>
+                              <w:t xml:space="preserve"> </w:t>
+                            </w:r>
+                            <w:r>
+                              <w:rPr>
+                                <w:sz w:val="26"/>
+                                <w:szCs w:val="26"/>
+                              </w:rPr>
+                              <w:t>Characterization</w:t>
+                            </w:r>
+                          </w:p>
+                          <w:p>
+                            <w:pPr>
+                              <w:jc w:val="center"/>
+                              <w:rPr>
+                                <w:sz w:val="40"/>
+                                <w:szCs w:val="40"/>
+                              </w:rPr>
+                            </w:pPr>
+                          </w:p>
+                        </w:txbxContent>
+                      </wps:txbx>
+                      <wps:bodyPr rot="0" spcFirstLastPara="0" vertOverflow="overflow" horzOverflow="overflow" vert="horz" wrap="square" lIns="91440" tIns="45720" rIns="91440" bIns="45720" numCol="1" spcCol="0" rtlCol="0" fromWordArt="0" anchor="ctr" anchorCtr="0" forceAA="0" compatLnSpc="1">
+                        <a:prstTxWarp prst="textNoShape">
+                          <a:avLst/>
+                        </a:prstTxWarp>
+                        <a:noAutofit/>
+                      </wps:bodyPr>
+                    </wps:wsp>
+                  </a:graphicData>
+                </a:graphic>
+                <wp14:sizeRelH relativeFrom="margin">
+                  <wp14:pctWidth>0</wp14:pctWidth>
+                </wp14:sizeRelH>
+                <wp14:sizeRelV relativeFrom="margin">
+                  <wp14:pctHeight>0</wp14:pctHeight>
+                </wp14:sizeRelV>
+              </wp:anchor>
+            </w:drawing>
+          </mc:Choice>
+          <mc:Fallback>
+            <w:pict>
+              <v:rect w14:anchorId="63770F52" id="Rectangle 19" o:spid="_x0000_s1035" style="position:absolute;margin-left:366pt;margin-top:293.3pt;width:100.5pt;height:62.25pt;z-index:251808256;visibility:visible;mso-wrap-style:square;mso-width-percent:0;mso-height-percent:0;mso-wrap-distance-left:9pt;mso-wrap-distance-top:0;mso-wrap-distance-right:9pt;mso-wrap-distance-bottom:0;mso-position-horizontal:absolute;mso-position-horizontal-relative:text;mso-position-vertical:absolute;mso-position-vertical-relative:text;mso-width-percent:0;mso-height-percent:0;mso-width-relative:margin;mso-height-relative:margin;v-text-anchor:middle" o:gfxdata="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" fillcolor="#5a5a5a [2109]" strokecolor="#0a121c [484]" strokeweight="2pt">
+                <v:textbox>
+                  <w:txbxContent>
+                    <w:p>
+                      <w:pPr>
+                        <w:jc w:val="center"/>
+                        <w:rPr>
+                          <w:sz w:val="26"/>
+                          <w:szCs w:val="26"/>
+                        </w:rPr>
+                      </w:pPr>
+                      <w:r>
+                        <w:rPr>
+                          <w:sz w:val="26"/>
+                          <w:szCs w:val="26"/>
+                        </w:rPr>
+                        <w:t xml:space="preserve">Route Creation &amp; </w:t>
+                      </w:r>
+                      <w:r>
+                        <w:rPr>
+                          <w:sz w:val="26"/>
+                          <w:szCs w:val="26"/>
+                        </w:rPr>
+                        <w:t>Vehicle</w:t>
+                      </w:r>
+                      <w:r>
+                        <w:rPr>
+                          <w:sz w:val="26"/>
+                          <w:szCs w:val="26"/>
+                        </w:rPr>
+                        <w:t xml:space="preserve"> </w:t>
+                      </w:r>
+                      <w:r>
+                        <w:rPr>
+                          <w:sz w:val="26"/>
+                          <w:szCs w:val="26"/>
+                        </w:rPr>
+                        <w:t>Fleet</w:t>
+                      </w:r>
+                      <w:r>
+                        <w:rPr>
+                          <w:sz w:val="26"/>
+                          <w:szCs w:val="26"/>
+                        </w:rPr>
+                        <w:t xml:space="preserve"> </w:t>
+                      </w:r>
+                      <w:r>
+                        <w:rPr>
+                          <w:sz w:val="26"/>
+                          <w:szCs w:val="26"/>
+                        </w:rPr>
+                        <w:t>Characterization</w:t>
+                      </w:r>
+                    </w:p>
+                    <w:p>
+                      <w:pPr>
+                        <w:jc w:val="center"/>
+                        <w:rPr>
+                          <w:sz w:val="40"/>
+                          <w:szCs w:val="40"/>
+                        </w:rPr>
+                      </w:pPr>
+                    </w:p>
+                  </w:txbxContent>
+                </v:textbox>
+              </v:rect>
+            </w:pict>
+          </mc:Fallback>
+        </mc:AlternateContent>
+      </w:r>
+      <w:r>
+        <w:rPr>
+          <w:noProof/>
+        </w:rPr>
+        <mc:AlternateContent>
+          <mc:Choice Requires="wps">
+            <w:drawing>
+              <wp:anchor distT="0" distB="0" distL="114300" distR="114300" simplePos="0" relativeHeight="251883008" behindDoc="0" locked="0" layoutInCell="1" allowOverlap="1" wp14:anchorId="5DC9F0DC" wp14:editId="31C0CB46">
+                <wp:simplePos x="0" y="0"/>
+                <wp:positionH relativeFrom="column">
+                  <wp:posOffset>5161915</wp:posOffset>
+                </wp:positionH>
+                <wp:positionV relativeFrom="paragraph">
+                  <wp:posOffset>3343910</wp:posOffset>
+                </wp:positionV>
+                <wp:extent cx="293690" cy="264794"/>
+                <wp:effectExtent l="14605" t="4445" r="45085" b="45085"/>
+                <wp:wrapNone/>
+                <wp:docPr id="23" name="Arrow: Right 23"/>
+                <wp:cNvGraphicFramePr/>
+                <a:graphic xmlns:a="http://schemas.openxmlformats.org/drawingml/2006/main">
+                  <a:graphicData uri="http://schemas.microsoft.com/office/word/2010/wordprocessingShape">
+                    <wps:wsp>
+                      <wps:cNvSpPr/>
+                      <wps:spPr>
+                        <a:xfrm rot="5400000">
+                          <a:off x="0" y="0"/>
+                          <a:ext cx="293690" cy="264794"/>
+                        </a:xfrm>
+                        <a:prstGeom prst="rightArrow">
+                          <a:avLst/>
+                        </a:prstGeom>
+                        <a:solidFill>
+                          <a:schemeClr val="tx1">
+                            <a:lumMod val="65000"/>
+                            <a:lumOff val="35000"/>
+                          </a:schemeClr>
+                        </a:solidFill>
+                      </wps:spPr>
+                      <wps:style>
+                        <a:lnRef idx="2">
+                          <a:schemeClr val="accent1">
+                            <a:shade val="15000"/>
+                          </a:schemeClr>
+                        </a:lnRef>
+                        <a:fillRef idx="1">
+                          <a:schemeClr val="accent1"/>
+                        </a:fillRef>
+                        <a:effectRef idx="0">
+                          <a:schemeClr val="accent1"/>
+                        </a:effectRef>
+                        <a:fontRef idx="minor">
+                          <a:schemeClr val="lt1"/>
+                        </a:fontRef>
+                      </wps:style>
+                      <wps:bodyPr rot="0" spcFirstLastPara="0" vertOverflow="overflow" horzOverflow="overflow" vert="horz" wrap="square" lIns="91440" tIns="45720" rIns="91440" bIns="45720" numCol="1" spcCol="0" rtlCol="0" fromWordArt="0" anchor="ctr" anchorCtr="0" forceAA="0" compatLnSpc="1">
+                        <a:prstTxWarp prst="textNoShape">
+                          <a:avLst/>
+                        </a:prstTxWarp>
+                        <a:noAutofit/>
+                      </wps:bodyPr>
+                    </wps:wsp>
+                  </a:graphicData>
+                </a:graphic>
+                <wp14:sizeRelH relativeFrom="margin">
+                  <wp14:pctWidth>0</wp14:pctWidth>
+                </wp14:sizeRelH>
+                <wp14:sizeRelV relativeFrom="margin">
+                  <wp14:pctHeight>0</wp14:pctHeight>
+                </wp14:sizeRelV>
+              </wp:anchor>
+            </w:drawing>
+          </mc:Choice>
+          <mc:Fallback>
+            <w:pict>
+              <v:shape w14:anchorId="0446C867" id="Arrow: Right 23" o:spid="_x0000_s1026" type="#_x0000_t13" style="position:absolute;margin-left:406.45pt;margin-top:263.3pt;width:23.15pt;height:20.85pt;rotation:90;z-index:251883008;visibility:visible;mso-wrap-style:square;mso-width-percent:0;mso-height-percent:0;mso-wrap-distance-left:9pt;mso-wrap-distance-top:0;mso-wrap-distance-right:9pt;mso-wrap-distance-bottom:0;mso-position-horizontal:absolute;mso-position-horizontal-relative:text;mso-position-vertical:absolute;mso-position-vertical-relative:text;mso-width-percent:0;mso-height-percent:0;mso-width-relative:margin;mso-height-relative:margin;v-text-anchor:middle" o:gfxdata="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" adj="11863" fillcolor="#5a5a5a [2109]" strokecolor="#0a121c [484]" strokeweight="2pt"/>
+            </w:pict>
+          </mc:Fallback>
+        </mc:AlternateContent>
+      </w:r>
+      <w:r>
+        <w:rPr>
+          <w:noProof/>
+        </w:rPr>
+        <mc:AlternateContent>
+          <mc:Choice Requires="wps">
+            <w:drawing>
+              <wp:anchor distT="0" distB="0" distL="114300" distR="114300" simplePos="0" relativeHeight="251748864" behindDoc="0" locked="0" layoutInCell="1" allowOverlap="1" wp14:anchorId="5DC36627" wp14:editId="4E33FAA3">
+                <wp:simplePos x="0" y="0"/>
+                <wp:positionH relativeFrom="column">
+                  <wp:posOffset>4648200</wp:posOffset>
+                </wp:positionH>
+                <wp:positionV relativeFrom="paragraph">
+                  <wp:posOffset>2477135</wp:posOffset>
+                </wp:positionV>
+                <wp:extent cx="1276709" cy="762000"/>
+                <wp:effectExtent l="0" t="0" r="19050" b="19050"/>
+                <wp:wrapNone/>
+                <wp:docPr id="16" name="Rectangle 16"/>
+                <wp:cNvGraphicFramePr/>
+                <a:graphic xmlns:a="http://schemas.openxmlformats.org/drawingml/2006/main">
+                  <a:graphicData uri="http://schemas.microsoft.com/office/word/2010/wordprocessingShape">
+                    <wps:wsp>
+                      <wps:cNvSpPr/>
+                      <wps:spPr>
+                        <a:xfrm>
+                          <a:off x="0" y="0"/>
+                          <a:ext cx="1276709" cy="762000"/>
+                        </a:xfrm>
+                        <a:prstGeom prst="rect">
+                          <a:avLst/>
+                        </a:prstGeom>
+                        <a:solidFill>
+                          <a:schemeClr val="tx1">
+                            <a:lumMod val="65000"/>
+                            <a:lumOff val="35000"/>
+                          </a:schemeClr>
+                        </a:solidFill>
+                      </wps:spPr>
+                      <wps:style>
+                        <a:lnRef idx="2">
+                          <a:schemeClr val="accent1">
+                            <a:shade val="15000"/>
+                          </a:schemeClr>
+                        </a:lnRef>
+                        <a:fillRef idx="1">
+                          <a:schemeClr val="accent1"/>
+                        </a:fillRef>
+                        <a:effectRef idx="0">
+                          <a:schemeClr val="accent1"/>
+                        </a:effectRef>
+                        <a:fontRef idx="minor">
+                          <a:schemeClr val="lt1"/>
+                        </a:fontRef>
+                      </wps:style>
+                      <wps:txbx>
+                        <w:txbxContent>
+                          <w:p>
+                            <w:pPr>
+                              <w:jc w:val="center"/>
+                              <w:rPr>
+                                <w:sz w:val="26"/>
+                                <w:szCs w:val="26"/>
+                              </w:rPr>
+                            </w:pPr>
+                            <w:r>
+                              <w:rPr>
+                                <w:sz w:val="26"/>
+                                <w:szCs w:val="26"/>
+                              </w:rPr>
+                              <w:t>Vehicle</w:t>
+                            </w:r>
+                            <w:r>
+                              <w:rPr>
+                                <w:sz w:val="26"/>
+                                <w:szCs w:val="26"/>
+                              </w:rPr>
+                              <w:t xml:space="preserve"> </w:t>
+                            </w:r>
+                            <w:r>
+                              <w:rPr>
+                                <w:sz w:val="26"/>
+                                <w:szCs w:val="26"/>
+                              </w:rPr>
+                              <w:t>Configuration</w:t>
+                            </w:r>
+                            <w:r>
+                              <w:rPr>
+                                <w:sz w:val="26"/>
+                                <w:szCs w:val="26"/>
+                              </w:rPr>
+                              <w:t xml:space="preserve"> </w:t>
+                            </w:r>
+                            <w:r>
+                              <w:rPr>
+                                <w:sz w:val="26"/>
+                                <w:szCs w:val="26"/>
+                              </w:rPr>
+                              <w:t>in</w:t>
+                            </w:r>
+                            <w:r>
+                              <w:rPr>
+                                <w:sz w:val="26"/>
+                                <w:szCs w:val="26"/>
+                              </w:rPr>
+                              <w:t xml:space="preserve"> </w:t>
+                            </w:r>
+                            <w:r>
+                              <w:rPr>
+                                <w:sz w:val="26"/>
+                                <w:szCs w:val="26"/>
+                              </w:rPr>
+                              <w:t>SUMO</w:t>
+                            </w:r>
+                          </w:p>
+                          <w:p>
+                            <w:pPr>
+                              <w:jc w:val="center"/>
+                              <w:rPr>
+                                <w:sz w:val="40"/>
+                                <w:szCs w:val="40"/>
+                              </w:rPr>
+                            </w:pPr>
+                          </w:p>
+                        </w:txbxContent>
+                      </wps:txbx>
+                      <wps:bodyPr rot="0" spcFirstLastPara="0" vertOverflow="overflow" horzOverflow="overflow" vert="horz" wrap="square" lIns="91440" tIns="45720" rIns="91440" bIns="45720" numCol="1" spcCol="0" rtlCol="0" fromWordArt="0" anchor="ctr" anchorCtr="0" forceAA="0" compatLnSpc="1">
+                        <a:prstTxWarp prst="textNoShape">
+                          <a:avLst/>
+                        </a:prstTxWarp>
+                        <a:noAutofit/>
+                      </wps:bodyPr>
+                    </wps:wsp>
+                  </a:graphicData>
+                </a:graphic>
+                <wp14:sizeRelH relativeFrom="margin">
+                  <wp14:pctWidth>0</wp14:pctWidth>
+                </wp14:sizeRelH>
+                <wp14:sizeRelV relativeFrom="margin">
+                  <wp14:pctHeight>0</wp14:pctHeight>
+                </wp14:sizeRelV>
+              </wp:anchor>
+            </w:drawing>
+          </mc:Choice>
+          <mc:Fallback>
+            <w:pict>
+              <v:rect w14:anchorId="5DC36627" id="Rectangle 16" o:spid="_x0000_s1036" style="position:absolute;margin-left:366pt;margin-top:195.05pt;width:100.55pt;height:60pt;z-index:251748864;visibility:visible;mso-wrap-style:square;mso-width-percent:0;mso-height-percent:0;mso-wrap-distance-left:9pt;mso-wrap-distance-top:0;mso-wrap-distance-right:9pt;mso-wrap-distance-bottom:0;mso-position-horizontal:absolute;mso-position-horizontal-relative:text;mso-position-vertical:absolute;mso-position-vertical-relative:text;mso-width-percent:0;mso-height-percent:0;mso-width-relative:margin;mso-height-relative:margin;v-text-anchor:middle" o:gfxdata="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" fillcolor="#5a5a5a [2109]" strokecolor="#0a121c [484]" strokeweight="2pt">
+                <v:textbox>
+                  <w:txbxContent>
+                    <w:p>
+                      <w:pPr>
+                        <w:jc w:val="center"/>
+                        <w:rPr>
+                          <w:sz w:val="26"/>
+                          <w:szCs w:val="26"/>
+                        </w:rPr>
+                      </w:pPr>
+                      <w:r>
+                        <w:rPr>
+                          <w:sz w:val="26"/>
+                          <w:szCs w:val="26"/>
+                        </w:rPr>
+                        <w:t>Vehicle</w:t>
+                      </w:r>
+                      <w:r>
+                        <w:rPr>
+                          <w:sz w:val="26"/>
+                          <w:szCs w:val="26"/>
+                        </w:rPr>
+                        <w:t xml:space="preserve"> </w:t>
+                      </w:r>
+                      <w:r>
+                        <w:rPr>
+                          <w:sz w:val="26"/>
+                          <w:szCs w:val="26"/>
+                        </w:rPr>
+                        <w:t>Configuration</w:t>
+                      </w:r>
+                      <w:r>
+                        <w:rPr>
+                          <w:sz w:val="26"/>
+                          <w:szCs w:val="26"/>
+                        </w:rPr>
+                        <w:t xml:space="preserve"> </w:t>
+                      </w:r>
+                      <w:r>
+                        <w:rPr>
+                          <w:sz w:val="26"/>
+                          <w:szCs w:val="26"/>
+                        </w:rPr>
+                        <w:t>in</w:t>
+                      </w:r>
+                      <w:r>
+                        <w:rPr>
+                          <w:sz w:val="26"/>
+                          <w:szCs w:val="26"/>
+                        </w:rPr>
+                        <w:t xml:space="preserve"> </w:t>
+                      </w:r>
+                      <w:r>
+                        <w:rPr>
+                          <w:sz w:val="26"/>
+                          <w:szCs w:val="26"/>
+                        </w:rPr>
+                        <w:t>SUMO</w:t>
+                      </w:r>
+                    </w:p>
+                    <w:p>
+                      <w:pPr>
+                        <w:jc w:val="center"/>
+                        <w:rPr>
+                          <w:sz w:val="40"/>
+                          <w:szCs w:val="40"/>
+                        </w:rPr>
+                      </w:pPr>
+                    </w:p>
+                  </w:txbxContent>
+                </v:textbox>
+              </v:rect>
+            </w:pict>
+          </mc:Fallback>
+        </mc:AlternateContent>
+      </w:r>
+      <w:r>
+        <w:rPr>
+          <w:noProof/>
+        </w:rPr>
+        <mc:AlternateContent>
+          <mc:Choice Requires="wps">
+            <w:drawing>
+              <wp:anchor distT="0" distB="0" distL="114300" distR="114300" simplePos="0" relativeHeight="251781632" behindDoc="0" locked="0" layoutInCell="1" allowOverlap="1" wp14:anchorId="5F4D52C5" wp14:editId="5D0A2640">
+                <wp:simplePos x="0" y="0"/>
+                <wp:positionH relativeFrom="column">
+                  <wp:posOffset>5152390</wp:posOffset>
+                </wp:positionH>
+                <wp:positionV relativeFrom="paragraph">
+                  <wp:posOffset>2077085</wp:posOffset>
+                </wp:positionV>
+                <wp:extent cx="293690" cy="264794"/>
+                <wp:effectExtent l="14605" t="4445" r="45085" b="45085"/>
+                <wp:wrapNone/>
+                <wp:docPr id="18" name="Arrow: Right 18"/>
+                <wp:cNvGraphicFramePr/>
+                <a:graphic xmlns:a="http://schemas.openxmlformats.org/drawingml/2006/main">
+                  <a:graphicData uri="http://schemas.microsoft.com/office/word/2010/wordprocessingShape">
+                    <wps:wsp>
+                      <wps:cNvSpPr/>
+                      <wps:spPr>
+                        <a:xfrm rot="5400000">
+                          <a:off x="0" y="0"/>
+                          <a:ext cx="293690" cy="264794"/>
+                        </a:xfrm>
+                        <a:prstGeom prst="rightArrow">
+                          <a:avLst/>
+                        </a:prstGeom>
+                        <a:solidFill>
+                          <a:schemeClr val="tx1">
+                            <a:lumMod val="65000"/>
+                            <a:lumOff val="35000"/>
+                          </a:schemeClr>
+                        </a:solidFill>
+                      </wps:spPr>
+                      <wps:style>
+                        <a:lnRef idx="2">
+                          <a:schemeClr val="accent1">
+                            <a:shade val="15000"/>
+                          </a:schemeClr>
+                        </a:lnRef>
+                        <a:fillRef idx="1">
+                          <a:schemeClr val="accent1"/>
+                        </a:fillRef>
+                        <a:effectRef idx="0">
+                          <a:schemeClr val="accent1"/>
+                        </a:effectRef>
+                        <a:fontRef idx="minor">
+                          <a:schemeClr val="lt1"/>
+                        </a:fontRef>
+                      </wps:style>
+                      <wps:bodyPr rot="0" spcFirstLastPara="0" vertOverflow="overflow" horzOverflow="overflow" vert="horz" wrap="square" lIns="91440" tIns="45720" rIns="91440" bIns="45720" numCol="1" spcCol="0" rtlCol="0" fromWordArt="0" anchor="ctr" anchorCtr="0" forceAA="0" compatLnSpc="1">
+                        <a:prstTxWarp prst="textNoShape">
+                          <a:avLst/>
+                        </a:prstTxWarp>
+                        <a:noAutofit/>
+                      </wps:bodyPr>
+                    </wps:wsp>
+                  </a:graphicData>
+                </a:graphic>
+                <wp14:sizeRelH relativeFrom="margin">
+                  <wp14:pctWidth>0</wp14:pctWidth>
+                </wp14:sizeRelH>
+                <wp14:sizeRelV relativeFrom="margin">
+                  <wp14:pctHeight>0</wp14:pctHeight>
+                </wp14:sizeRelV>
+              </wp:anchor>
+            </w:drawing>
+          </mc:Choice>
+          <mc:Fallback>
+            <w:pict>
+              <v:shape w14:anchorId="184F69A1" id="Arrow: Right 18" o:spid="_x0000_s1026" type="#_x0000_t13" style="position:absolute;margin-left:405.7pt;margin-top:163.55pt;width:23.15pt;height:20.85pt;rotation:90;z-index:251781632;visibility:visible;mso-wrap-style:square;mso-width-percent:0;mso-height-percent:0;mso-wrap-distance-left:9pt;mso-wrap-distance-top:0;mso-wrap-distance-right:9pt;mso-wrap-distance-bottom:0;mso-position-horizontal:absolute;mso-position-horizontal-relative:text;mso-position-vertical:absolute;mso-position-vertical-relative:text;mso-width-percent:0;mso-height-percent:0;mso-width-relative:margin;mso-height-relative:margin;v-text-anchor:middle" o:gfxdata="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" adj="11863" fillcolor="#5a5a5a [2109]" strokecolor="#0a121c [484]" strokeweight="2pt"/>
+            </w:pict>
+          </mc:Fallback>
+        </mc:AlternateContent>
+      </w:r>
+      <w:r>
+        <w:rPr>
+          <w:noProof/>
+        </w:rPr>
+        <mc:AlternateContent>
+          <mc:Choice Requires="wps">
+            <w:drawing>
+              <wp:anchor distT="0" distB="0" distL="114300" distR="114300" simplePos="0" relativeHeight="251557376" behindDoc="0" locked="0" layoutInCell="1" allowOverlap="1" wp14:anchorId="4E28252D" wp14:editId="11BF3212">
+                <wp:simplePos x="0" y="0"/>
+                <wp:positionH relativeFrom="column">
+                  <wp:posOffset>5140960</wp:posOffset>
+                </wp:positionH>
+                <wp:positionV relativeFrom="paragraph">
+                  <wp:posOffset>864870</wp:posOffset>
+                </wp:positionV>
+                <wp:extent cx="293690" cy="264794"/>
+                <wp:effectExtent l="14605" t="4445" r="45085" b="45085"/>
+                <wp:wrapNone/>
+                <wp:docPr id="7" name="Arrow: Right 7"/>
+                <wp:cNvGraphicFramePr/>
+                <a:graphic xmlns:a="http://schemas.openxmlformats.org/drawingml/2006/main">
+                  <a:graphicData uri="http://schemas.microsoft.com/office/word/2010/wordprocessingShape">
+                    <wps:wsp>
+                      <wps:cNvSpPr/>
+                      <wps:spPr>
+                        <a:xfrm rot="5400000">
+                          <a:off x="0" y="0"/>
+                          <a:ext cx="293690" cy="264794"/>
+                        </a:xfrm>
+                        <a:prstGeom prst="rightArrow">
+                          <a:avLst/>
+                        </a:prstGeom>
+                        <a:solidFill>
+                          <a:schemeClr val="tx1">
+                            <a:lumMod val="65000"/>
+                            <a:lumOff val="35000"/>
+                          </a:schemeClr>
+                        </a:solidFill>
+                      </wps:spPr>
+                      <wps:style>
+                        <a:lnRef idx="2">
+                          <a:schemeClr val="accent1">
+                            <a:shade val="15000"/>
+                          </a:schemeClr>
+                        </a:lnRef>
+                        <a:fillRef idx="1">
+                          <a:schemeClr val="accent1"/>
+                        </a:fillRef>
+                        <a:effectRef idx="0">
+                          <a:schemeClr val="accent1"/>
+                        </a:effectRef>
+                        <a:fontRef idx="minor">
+                          <a:schemeClr val="lt1"/>
+                        </a:fontRef>
+                      </wps:style>
+                      <wps:bodyPr rot="0" spcFirstLastPara="0" vertOverflow="overflow" horzOverflow="overflow" vert="horz" wrap="square" lIns="91440" tIns="45720" rIns="91440" bIns="45720" numCol="1" spcCol="0" rtlCol="0" fromWordArt="0" anchor="ctr" anchorCtr="0" forceAA="0" compatLnSpc="1">
+                        <a:prstTxWarp prst="textNoShape">
+                          <a:avLst/>
+                        </a:prstTxWarp>
+                        <a:noAutofit/>
+                      </wps:bodyPr>
+                    </wps:wsp>
+                  </a:graphicData>
+                </a:graphic>
+                <wp14:sizeRelH relativeFrom="margin">
+                  <wp14:pctWidth>0</wp14:pctWidth>
+                </wp14:sizeRelH>
+                <wp14:sizeRelV relativeFrom="margin">
+                  <wp14:pctHeight>0</wp14:pctHeight>
+                </wp14:sizeRelV>
+              </wp:anchor>
+            </w:drawing>
+          </mc:Choice>
+          <mc:Fallback>
+            <w:pict>
+              <v:shape w14:anchorId="309FF388" id="Arrow: Right 7" o:spid="_x0000_s1026" type="#_x0000_t13" style="position:absolute;margin-left:404.8pt;margin-top:68.1pt;width:23.15pt;height:20.85pt;rotation:90;z-index:251557376;visibility:visible;mso-wrap-style:square;mso-width-percent:0;mso-height-percent:0;mso-wrap-distance-left:9pt;mso-wrap-distance-top:0;mso-wrap-distance-right:9pt;mso-wrap-distance-bottom:0;mso-position-horizontal:absolute;mso-position-horizontal-relative:text;mso-position-vertical:absolute;mso-position-vertical-relative:text;mso-width-percent:0;mso-height-percent:0;mso-width-relative:margin;mso-height-relative:margin;v-text-anchor:middle" o:gfxdata="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" adj="11863" fillcolor="#5a5a5a [2109]" strokecolor="#0a121c [484]" strokeweight="2pt"/>
+            </w:pict>
+          </mc:Fallback>
+        </mc:AlternateContent>
+      </w:r>
+      <w:r>
+        <w:rPr>
+          <w:noProof/>
+        </w:rPr>
+        <mc:AlternateContent>
+          <mc:Choice Requires="wps">
+            <w:drawing>
+              <wp:anchor distT="0" distB="0" distL="114300" distR="114300" simplePos="0" relativeHeight="251768320" behindDoc="0" locked="0" layoutInCell="1" allowOverlap="1" wp14:anchorId="210D9469" wp14:editId="75E166CE">
+                <wp:simplePos x="0" y="0"/>
+                <wp:positionH relativeFrom="column">
+                  <wp:posOffset>4648200</wp:posOffset>
+                </wp:positionH>
+                <wp:positionV relativeFrom="paragraph">
+                  <wp:posOffset>1230630</wp:posOffset>
+                </wp:positionV>
+                <wp:extent cx="1276709" cy="762000"/>
+                <wp:effectExtent l="0" t="0" r="19050" b="19050"/>
+                <wp:wrapNone/>
+                <wp:docPr id="17" name="Rectangle 17"/>
+                <wp:cNvGraphicFramePr/>
+                <a:graphic xmlns:a="http://schemas.openxmlformats.org/drawingml/2006/main">
+                  <a:graphicData uri="http://schemas.microsoft.com/office/word/2010/wordprocessingShape">
+                    <wps:wsp>
+                      <wps:cNvSpPr/>
+                      <wps:spPr>
+                        <a:xfrm>
+                          <a:off x="0" y="0"/>
+                          <a:ext cx="1276709" cy="762000"/>
+                        </a:xfrm>
+                        <a:prstGeom prst="rect">
+                          <a:avLst/>
+                        </a:prstGeom>
+                        <a:solidFill>
+                          <a:schemeClr val="tx1">
+                            <a:lumMod val="65000"/>
+                            <a:lumOff val="35000"/>
+                          </a:schemeClr>
+                        </a:solidFill>
+                      </wps:spPr>
+                      <wps:style>
+                        <a:lnRef idx="2">
+                          <a:schemeClr val="accent1">
+                            <a:shade val="15000"/>
+                          </a:schemeClr>
+                        </a:lnRef>
+                        <a:fillRef idx="1">
+                          <a:schemeClr val="accent1"/>
+                        </a:fillRef>
+                        <a:effectRef idx="0">
+                          <a:schemeClr val="accent1"/>
+                        </a:effectRef>
+                        <a:fontRef idx="minor">
+                          <a:schemeClr val="lt1"/>
+                        </a:fontRef>
+                      </wps:style>
+                      <wps:txbx>
+                        <w:txbxContent>
+                          <w:p>
+                            <w:pPr>
+                              <w:jc w:val="center"/>
+                              <w:rPr>
+                                <w:sz w:val="26"/>
+                                <w:szCs w:val="26"/>
+                              </w:rPr>
+                            </w:pPr>
+                            <w:r>
+                              <w:rPr>
+                                <w:sz w:val="26"/>
+                                <w:szCs w:val="26"/>
+                              </w:rPr>
+                              <w:t>Charging</w:t>
+                            </w:r>
+                            <w:r>
+                              <w:rPr>
+                                <w:sz w:val="26"/>
+                                <w:szCs w:val="26"/>
+                              </w:rPr>
+                              <w:t xml:space="preserve"> </w:t>
+                            </w:r>
+                            <w:r>
+                              <w:rPr>
+                                <w:sz w:val="26"/>
+                                <w:szCs w:val="26"/>
+                              </w:rPr>
+                              <w:t>Station</w:t>
+                            </w:r>
+                            <w:r>
+                              <w:rPr>
+                                <w:sz w:val="26"/>
+                                <w:szCs w:val="26"/>
+                              </w:rPr>
+                              <w:t xml:space="preserve"> </w:t>
+                            </w:r>
+                            <w:r>
+                              <w:rPr>
+                                <w:sz w:val="26"/>
+                                <w:szCs w:val="26"/>
+                              </w:rPr>
+                              <w:t>Placement</w:t>
+                            </w:r>
+                          </w:p>
+                          <w:p>
+                            <w:pPr>
+                              <w:jc w:val="center"/>
+                              <w:rPr>
+                                <w:sz w:val="40"/>
+                                <w:szCs w:val="40"/>
+                              </w:rPr>
+                            </w:pPr>
+                          </w:p>
+                        </w:txbxContent>
+                      </wps:txbx>
+                      <wps:bodyPr rot="0" spcFirstLastPara="0" vertOverflow="overflow" horzOverflow="overflow" vert="horz" wrap="square" lIns="91440" tIns="45720" rIns="91440" bIns="45720" numCol="1" spcCol="0" rtlCol="0" fromWordArt="0" anchor="ctr" anchorCtr="0" forceAA="0" compatLnSpc="1">
+                        <a:prstTxWarp prst="textNoShape">
+                          <a:avLst/>
+                        </a:prstTxWarp>
+                        <a:noAutofit/>
+                      </wps:bodyPr>
+                    </wps:wsp>
+                  </a:graphicData>
+                </a:graphic>
+                <wp14:sizeRelH relativeFrom="margin">
+                  <wp14:pctWidth>0</wp14:pctWidth>
+                </wp14:sizeRelH>
+                <wp14:sizeRelV relativeFrom="margin">
+                  <wp14:pctHeight>0</wp14:pctHeight>
+                </wp14:sizeRelV>
+              </wp:anchor>
+            </w:drawing>
+          </mc:Choice>
+          <mc:Fallback>
+            <w:pict>
+              <v:rect w14:anchorId="210D9469" id="Rectangle 17" o:spid="_x0000_s1037" style="position:absolute;margin-left:366pt;margin-top:96.9pt;width:100.55pt;height:60pt;z-index:251768320;visibility:visible;mso-wrap-style:square;mso-width-percent:0;mso-height-percent:0;mso-wrap-distance-left:9pt;mso-wrap-distance-top:0;mso-wrap-distance-right:9pt;mso-wrap-distance-bottom:0;mso-position-horizontal:absolute;mso-position-horizontal-relative:text;mso-position-vertical:absolute;mso-position-vertical-relative:text;mso-width-percent:0;mso-height-percent:0;mso-width-relative:margin;mso-height-relative:margin;v-text-anchor:middle" o:gfxdata="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" fillcolor="#5a5a5a [2109]" strokecolor="#0a121c [484]" strokeweight="2pt">
+                <v:textbox>
+                  <w:txbxContent>
+                    <w:p>
+                      <w:pPr>
+                        <w:jc w:val="center"/>
+                        <w:rPr>
+                          <w:sz w:val="26"/>
+                          <w:szCs w:val="26"/>
+                        </w:rPr>
+                      </w:pPr>
+                      <w:r>
+                        <w:rPr>
+                          <w:sz w:val="26"/>
+                          <w:szCs w:val="26"/>
+                        </w:rPr>
+                        <w:t>Charging</w:t>
+                      </w:r>
+                      <w:r>
+                        <w:rPr>
+                          <w:sz w:val="26"/>
+                          <w:szCs w:val="26"/>
+                        </w:rPr>
+                        <w:t xml:space="preserve"> </w:t>
+                      </w:r>
+                      <w:r>
+                        <w:rPr>
+                          <w:sz w:val="26"/>
+                          <w:szCs w:val="26"/>
+                        </w:rPr>
+                        <w:t>Station</w:t>
+                      </w:r>
+                      <w:r>
+                        <w:rPr>
+                          <w:sz w:val="26"/>
+                          <w:szCs w:val="26"/>
+                        </w:rPr>
+                        <w:t xml:space="preserve"> </w:t>
+                      </w:r>
+                      <w:r>
+                        <w:rPr>
+                          <w:sz w:val="26"/>
+                          <w:szCs w:val="26"/>
+                        </w:rPr>
+                        <w:t>Placement</w:t>
+                      </w:r>
+                    </w:p>
+                    <w:p>
+                      <w:pPr>
+                        <w:jc w:val="center"/>
+                        <w:rPr>
+                          <w:sz w:val="40"/>
+                          <w:szCs w:val="40"/>
+                        </w:rPr>
+                      </w:pPr>
+                    </w:p>
+                  </w:txbxContent>
+                </v:textbox>
+              </v:rect>
+            </w:pict>
+          </mc:Fallback>
+        </mc:AlternateContent>
+      </w:r>
+      <w:r>
+        <w:rPr>
+          <w:noProof/>
+        </w:rPr>
+        <mc:AlternateContent>
+          <mc:Choice Requires="wps">
+            <w:drawing>
+              <wp:anchor distT="0" distB="0" distL="114300" distR="114300" simplePos="0" relativeHeight="251365888" behindDoc="0" locked="0" layoutInCell="1" allowOverlap="1" wp14:anchorId="294C40C2" wp14:editId="507A43E5">
+                <wp:simplePos x="0" y="0"/>
+                <wp:positionH relativeFrom="column">
+                  <wp:posOffset>1920240</wp:posOffset>
+                </wp:positionH>
+                <wp:positionV relativeFrom="paragraph">
+                  <wp:posOffset>7589520</wp:posOffset>
+                </wp:positionV>
+                <wp:extent cx="2073349" cy="861238"/>
+                <wp:effectExtent l="0" t="0" r="22225" b="15240"/>
+                <wp:wrapNone/>
+                <wp:docPr id="2" name="Rectangle 2"/>
+                <wp:cNvGraphicFramePr/>
+                <a:graphic xmlns:a="http://schemas.openxmlformats.org/drawingml/2006/main">
+                  <a:graphicData uri="http://schemas.microsoft.com/office/word/2010/wordprocessingShape">
+                    <wps:wsp>
+                      <wps:cNvSpPr/>
+                      <wps:spPr>
+                        <a:xfrm>
+                          <a:off x="0" y="0"/>
+                          <a:ext cx="2073349" cy="861238"/>
+                        </a:xfrm>
+                        <a:prstGeom prst="rect">
+                          <a:avLst/>
+                        </a:prstGeom>
+                        <a:solidFill>
+                          <a:schemeClr val="tx1">
+                            <a:lumMod val="65000"/>
+                            <a:lumOff val="35000"/>
+                          </a:schemeClr>
+                        </a:solidFill>
+                      </wps:spPr>
+                      <wps:style>
+                        <a:lnRef idx="2">
+                          <a:schemeClr val="accent1">
+                            <a:shade val="15000"/>
+                          </a:schemeClr>
+                        </a:lnRef>
+                        <a:fillRef idx="1">
+                          <a:schemeClr val="accent1"/>
+                        </a:fillRef>
+                        <a:effectRef idx="0">
+                          <a:schemeClr val="accent1"/>
+                        </a:effectRef>
+                        <a:fontRef idx="minor">
+                          <a:schemeClr val="lt1"/>
+                        </a:fontRef>
+                      </wps:style>
+                      <wps:txbx>
+                        <w:txbxContent>
+                          <w:p>
+                            <w:pPr>
+                              <w:jc w:val="center"/>
+                              <w:rPr>
+                                <w:sz w:val="40"/>
+                                <w:szCs w:val="40"/>
+                              </w:rPr>
+                            </w:pPr>
+                            <w:r>
+                              <w:rPr>
+                                <w:sz w:val="40"/>
+                                <w:szCs w:val="40"/>
+                              </w:rPr>
+                              <w:t xml:space="preserve">Data </w:t>
+                            </w:r>
+                            <w:r>
+                              <w:rPr>
+                                <w:sz w:val="40"/>
+                                <w:szCs w:val="40"/>
+                              </w:rPr>
+                              <w:t>L</w:t>
+                            </w:r>
+                            <w:r>
+                              <w:rPr>
+                                <w:sz w:val="40"/>
+                                <w:szCs w:val="40"/>
+                              </w:rPr>
+                              <w:t>ogging</w:t>
+                            </w:r>
+                          </w:p>
+                        </w:txbxContent>
+                      </wps:txbx>
+                      <wps:bodyPr rot="0" spcFirstLastPara="0" vertOverflow="overflow" horzOverflow="overflow" vert="horz" wrap="square" lIns="91440" tIns="45720" rIns="91440" bIns="45720" numCol="1" spcCol="0" rtlCol="0" fromWordArt="0" anchor="ctr" anchorCtr="0" forceAA="0" compatLnSpc="1">
+                        <a:prstTxWarp prst="textNoShape">
+                          <a:avLst/>
+                        </a:prstTxWarp>
+                        <a:noAutofit/>
+                      </wps:bodyPr>
+                    </wps:wsp>
+                  </a:graphicData>
+                </a:graphic>
+              </wp:anchor>
+            </w:drawing>
+          </mc:Choice>
+          <mc:Fallback>
+            <w:pict>
+              <v:rect w14:anchorId="294C40C2" id="Rectangle 2" o:spid="_x0000_s1038" style="position:absolute;margin-left:151.2pt;margin-top:597.6pt;width:163.25pt;height:67.8pt;z-index:251365888;visibility:visible;mso-wrap-style:square;mso-wrap-distance-left:9pt;mso-wrap-distance-top:0;mso-wrap-distance-right:9pt;mso-wrap-distance-bottom:0;mso-position-horizontal:absolute;mso-position-horizontal-relative:text;mso-position-vertical:absolute;mso-position-vertical-relative:text;v-text-anchor:middle" o:gfxdata="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" fillcolor="#5a5a5a [2109]" strokecolor="#0a121c [484]" strokeweight="2pt">
+                <v:textbox>
+                  <w:txbxContent>
+                    <w:p>
+                      <w:pPr>
+                        <w:jc w:val="center"/>
+                        <w:rPr>
+                          <w:sz w:val="40"/>
+                          <w:szCs w:val="40"/>
+                        </w:rPr>
+                      </w:pPr>
+                      <w:r>
+                        <w:rPr>
+                          <w:sz w:val="40"/>
+                          <w:szCs w:val="40"/>
+                        </w:rPr>
+                        <w:t xml:space="preserve">Data </w:t>
+                      </w:r>
+                      <w:r>
+                        <w:rPr>
+                          <w:sz w:val="40"/>
+                          <w:szCs w:val="40"/>
+                        </w:rPr>
+                        <w:t>L</w:t>
+                      </w:r>
+                      <w:r>
+                        <w:rPr>
+                          <w:sz w:val="40"/>
+                          <w:szCs w:val="40"/>
+                        </w:rPr>
+                        <w:t>ogging</w:t>
+                      </w:r>
+                    </w:p>
+                  </w:txbxContent>
+                </v:textbox>
+              </v:rect>
+            </w:pict>
+          </mc:Fallback>
+        </mc:AlternateContent>
+      </w:r>
+      <w:r>
+        <w:rPr>
+          <w:noProof/>
+        </w:rPr>
+        <mc:AlternateContent>
+          <mc:Choice Requires="wps">
+            <w:drawing>
+              <wp:anchor distT="0" distB="0" distL="114300" distR="114300" simplePos="0" relativeHeight="251457024" behindDoc="0" locked="0" layoutInCell="1" allowOverlap="1" wp14:anchorId="534345C8" wp14:editId="09F38882">
+                <wp:simplePos x="0" y="0"/>
+                <wp:positionH relativeFrom="column">
+                  <wp:posOffset>-546100</wp:posOffset>
+                </wp:positionH>
+                <wp:positionV relativeFrom="paragraph">
+                  <wp:posOffset>7266940</wp:posOffset>
                 </wp:positionV>
                 <wp:extent cx="2073349" cy="861238"/>
                 <wp:effectExtent l="0" t="0" r="22225" b="15240"/>
@@ -718,7 +3402,7 @@
           </mc:Choice>
           <mc:Fallback>
             <w:pict>
-              <v:rect w14:anchorId="534345C8" id="Rectangle 4" o:spid="_x0000_s1028" style="position:absolute;margin-left:51.25pt;margin-top:115.85pt;width:163.25pt;height:67.8pt;z-index:251665920;visibility:visible;mso-wrap-style:square;mso-wrap-distance-left:9pt;mso-wrap-distance-top:0;mso-wrap-distance-right:9pt;mso-wrap-distance-bottom:0;mso-position-horizontal:absolute;mso-position-horizontal-relative:text;mso-position-vertical:absolute;mso-position-vertical-relative:text;v-text-anchor:middle" o:gfxdata="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" fillcolor="#5a5a5a [2109]" strokecolor="#0a121c [484]" strokeweight="2pt">
+              <v:rect w14:anchorId="534345C8" id="Rectangle 4" o:spid="_x0000_s1039" style="position:absolute;margin-left:-43pt;margin-top:572.2pt;width:163.25pt;height:67.8pt;z-index:251457024;visibility:visible;mso-wrap-style:square;mso-wrap-distance-left:9pt;mso-wrap-distance-top:0;mso-wrap-distance-right:9pt;mso-wrap-distance-bottom:0;mso-position-horizontal:absolute;mso-position-horizontal-relative:text;mso-position-vertical:absolute;mso-position-vertical-relative:text;v-text-anchor:middle" o:gfxdata="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" fillcolor="#5a5a5a [2109]" strokecolor="#0a121c [484]" strokeweight="2pt">
                 <v:textbox>
                   <w:txbxContent>
                     <w:p>
@@ -751,18 +3435,18 @@
         <mc:AlternateContent>
           <mc:Choice Requires="wps">
             <w:drawing>
-              <wp:anchor distT="0" distB="0" distL="114300" distR="114300" simplePos="0" relativeHeight="251678208" behindDoc="0" locked="0" layoutInCell="1" allowOverlap="1" wp14:anchorId="0720A737" wp14:editId="569E5319">
+              <wp:anchor distT="0" distB="0" distL="114300" distR="114300" simplePos="0" relativeHeight="251659776" behindDoc="0" locked="0" layoutInCell="1" allowOverlap="1" wp14:anchorId="6BDE1D50" wp14:editId="3C22752C">
                 <wp:simplePos x="0" y="0"/>
                 <wp:positionH relativeFrom="column">
-                  <wp:posOffset>3468887</wp:posOffset>
+                  <wp:posOffset>2282825</wp:posOffset>
                 </wp:positionH>
                 <wp:positionV relativeFrom="paragraph">
-                  <wp:posOffset>1448908</wp:posOffset>
+                  <wp:posOffset>171114</wp:posOffset>
                 </wp:positionV>
-                <wp:extent cx="2073349" cy="861238"/>
-                <wp:effectExtent l="0" t="0" r="22225" b="15240"/>
+                <wp:extent cx="258792" cy="222490"/>
+                <wp:effectExtent l="0" t="19050" r="46355" b="44450"/>
                 <wp:wrapNone/>
-                <wp:docPr id="5" name="Rectangle 5"/>
+                <wp:docPr id="12" name="Arrow: Right 12"/>
                 <wp:cNvGraphicFramePr/>
                 <a:graphic xmlns:a="http://schemas.openxmlformats.org/drawingml/2006/main">
                   <a:graphicData uri="http://schemas.microsoft.com/office/word/2010/wordprocessingShape">
@@ -771,7 +3455,252 @@
                       <wps:spPr>
                         <a:xfrm>
                           <a:off x="0" y="0"/>
-                          <a:ext cx="2073349" cy="861238"/>
+                          <a:ext cx="258792" cy="222490"/>
+                        </a:xfrm>
+                        <a:prstGeom prst="rightArrow">
+                          <a:avLst/>
+                        </a:prstGeom>
+                        <a:solidFill>
+                          <a:schemeClr val="tx1">
+                            <a:lumMod val="65000"/>
+                            <a:lumOff val="35000"/>
+                          </a:schemeClr>
+                        </a:solidFill>
+                      </wps:spPr>
+                      <wps:style>
+                        <a:lnRef idx="2">
+                          <a:schemeClr val="accent1">
+                            <a:shade val="15000"/>
+                          </a:schemeClr>
+                        </a:lnRef>
+                        <a:fillRef idx="1">
+                          <a:schemeClr val="accent1"/>
+                        </a:fillRef>
+                        <a:effectRef idx="0">
+                          <a:schemeClr val="accent1"/>
+                        </a:effectRef>
+                        <a:fontRef idx="minor">
+                          <a:schemeClr val="lt1"/>
+                        </a:fontRef>
+                      </wps:style>
+                      <wps:bodyPr rot="0" spcFirstLastPara="0" vertOverflow="overflow" horzOverflow="overflow" vert="horz" wrap="square" lIns="91440" tIns="45720" rIns="91440" bIns="45720" numCol="1" spcCol="0" rtlCol="0" fromWordArt="0" anchor="ctr" anchorCtr="0" forceAA="0" compatLnSpc="1">
+                        <a:prstTxWarp prst="textNoShape">
+                          <a:avLst/>
+                        </a:prstTxWarp>
+                        <a:noAutofit/>
+                      </wps:bodyPr>
+                    </wps:wsp>
+                  </a:graphicData>
+                </a:graphic>
+                <wp14:sizeRelH relativeFrom="margin">
+                  <wp14:pctWidth>0</wp14:pctWidth>
+                </wp14:sizeRelH>
+                <wp14:sizeRelV relativeFrom="margin">
+                  <wp14:pctHeight>0</wp14:pctHeight>
+                </wp14:sizeRelV>
+              </wp:anchor>
+            </w:drawing>
+          </mc:Choice>
+          <mc:Fallback>
+            <w:pict>
+              <v:shape w14:anchorId="46B4C255" id="Arrow: Right 12" o:spid="_x0000_s1026" type="#_x0000_t13" style="position:absolute;margin-left:179.75pt;margin-top:13.45pt;width:20.4pt;height:17.5pt;z-index:251659776;visibility:visible;mso-wrap-style:square;mso-width-percent:0;mso-height-percent:0;mso-wrap-distance-left:9pt;mso-wrap-distance-top:0;mso-wrap-distance-right:9pt;mso-wrap-distance-bottom:0;mso-position-horizontal:absolute;mso-position-horizontal-relative:text;mso-position-vertical:absolute;mso-position-vertical-relative:text;mso-width-percent:0;mso-height-percent:0;mso-width-relative:margin;mso-height-relative:margin;v-text-anchor:middle" o:gfxdata="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" adj="12315" fillcolor="#5a5a5a [2109]" strokecolor="#0a121c [484]" strokeweight="2pt"/>
+            </w:pict>
+          </mc:Fallback>
+        </mc:AlternateContent>
+      </w:r>
+      <w:r>
+        <w:rPr>
+          <w:noProof/>
+        </w:rPr>
+        <mc:AlternateContent>
+          <mc:Choice Requires="wps">
+            <w:drawing>
+              <wp:anchor distT="0" distB="0" distL="114300" distR="114300" simplePos="0" relativeHeight="251643392" behindDoc="0" locked="0" layoutInCell="1" allowOverlap="1" wp14:anchorId="1536EF2A" wp14:editId="3D94DDD8">
+                <wp:simplePos x="0" y="0"/>
+                <wp:positionH relativeFrom="column">
+                  <wp:posOffset>1086929</wp:posOffset>
+                </wp:positionH>
+                <wp:positionV relativeFrom="paragraph">
+                  <wp:posOffset>0</wp:posOffset>
+                </wp:positionV>
+                <wp:extent cx="1078302" cy="594995"/>
+                <wp:effectExtent l="0" t="0" r="26670" b="14605"/>
+                <wp:wrapNone/>
+                <wp:docPr id="11" name="Rectangle 11"/>
+                <wp:cNvGraphicFramePr/>
+                <a:graphic xmlns:a="http://schemas.openxmlformats.org/drawingml/2006/main">
+                  <a:graphicData uri="http://schemas.microsoft.com/office/word/2010/wordprocessingShape">
+                    <wps:wsp>
+                      <wps:cNvSpPr/>
+                      <wps:spPr>
+                        <a:xfrm>
+                          <a:off x="0" y="0"/>
+                          <a:ext cx="1078302" cy="594995"/>
+                        </a:xfrm>
+                        <a:prstGeom prst="rect">
+                          <a:avLst/>
+                        </a:prstGeom>
+                        <a:solidFill>
+                          <a:schemeClr val="tx1">
+                            <a:lumMod val="65000"/>
+                            <a:lumOff val="35000"/>
+                          </a:schemeClr>
+                        </a:solidFill>
+                      </wps:spPr>
+                      <wps:style>
+                        <a:lnRef idx="2">
+                          <a:schemeClr val="accent1">
+                            <a:shade val="15000"/>
+                          </a:schemeClr>
+                        </a:lnRef>
+                        <a:fillRef idx="1">
+                          <a:schemeClr val="accent1"/>
+                        </a:fillRef>
+                        <a:effectRef idx="0">
+                          <a:schemeClr val="accent1"/>
+                        </a:effectRef>
+                        <a:fontRef idx="minor">
+                          <a:schemeClr val="lt1"/>
+                        </a:fontRef>
+                      </wps:style>
+                      <wps:txbx>
+                        <w:txbxContent>
+                          <w:p>
+                            <w:pPr>
+                              <w:rPr>
+                                <w:sz w:val="26"/>
+                                <w:szCs w:val="26"/>
+                              </w:rPr>
+                            </w:pPr>
+                            <w:r>
+                              <w:rPr>
+                                <w:sz w:val="26"/>
+                                <w:szCs w:val="26"/>
+                              </w:rPr>
+                              <w:t>Environment</w:t>
+                            </w:r>
+                            <w:r>
+                              <w:rPr>
+                                <w:sz w:val="26"/>
+                                <w:szCs w:val="26"/>
+                              </w:rPr>
+                              <w:t xml:space="preserve"> </w:t>
+                            </w:r>
+                            <w:r>
+                              <w:rPr>
+                                <w:sz w:val="26"/>
+                                <w:szCs w:val="26"/>
+                              </w:rPr>
+                              <w:t xml:space="preserve">Setup </w:t>
+                            </w:r>
+                          </w:p>
+                          <w:p>
+                            <w:pPr>
+                              <w:jc w:val="center"/>
+                              <w:rPr>
+                                <w:sz w:val="40"/>
+                                <w:szCs w:val="40"/>
+                              </w:rPr>
+                            </w:pPr>
+                          </w:p>
+                        </w:txbxContent>
+                      </wps:txbx>
+                      <wps:bodyPr rot="0" spcFirstLastPara="0" vertOverflow="overflow" horzOverflow="overflow" vert="horz" wrap="square" lIns="91440" tIns="45720" rIns="91440" bIns="45720" numCol="1" spcCol="0" rtlCol="0" fromWordArt="0" anchor="ctr" anchorCtr="0" forceAA="0" compatLnSpc="1">
+                        <a:prstTxWarp prst="textNoShape">
+                          <a:avLst/>
+                        </a:prstTxWarp>
+                        <a:noAutofit/>
+                      </wps:bodyPr>
+                    </wps:wsp>
+                  </a:graphicData>
+                </a:graphic>
+                <wp14:sizeRelH relativeFrom="margin">
+                  <wp14:pctWidth>0</wp14:pctWidth>
+                </wp14:sizeRelH>
+                <wp14:sizeRelV relativeFrom="margin">
+                  <wp14:pctHeight>0</wp14:pctHeight>
+                </wp14:sizeRelV>
+              </wp:anchor>
+            </w:drawing>
+          </mc:Choice>
+          <mc:Fallback>
+            <w:pict>
+              <v:rect w14:anchorId="1536EF2A" id="Rectangle 11" o:spid="_x0000_s1040" style="position:absolute;margin-left:85.6pt;margin-top:0;width:84.9pt;height:46.85pt;z-index:251643392;visibility:visible;mso-wrap-style:square;mso-width-percent:0;mso-height-percent:0;mso-wrap-distance-left:9pt;mso-wrap-distance-top:0;mso-wrap-distance-right:9pt;mso-wrap-distance-bottom:0;mso-position-horizontal:absolute;mso-position-horizontal-relative:text;mso-position-vertical:absolute;mso-position-vertical-relative:text;mso-width-percent:0;mso-height-percent:0;mso-width-relative:margin;mso-height-relative:margin;v-text-anchor:middle" o:gfxdata="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" fillcolor="#5a5a5a [2109]" strokecolor="#0a121c [484]" strokeweight="2pt">
+                <v:textbox>
+                  <w:txbxContent>
+                    <w:p>
+                      <w:pPr>
+                        <w:rPr>
+                          <w:sz w:val="26"/>
+                          <w:szCs w:val="26"/>
+                        </w:rPr>
+                      </w:pPr>
+                      <w:r>
+                        <w:rPr>
+                          <w:sz w:val="26"/>
+                          <w:szCs w:val="26"/>
+                        </w:rPr>
+                        <w:t>Environment</w:t>
+                      </w:r>
+                      <w:r>
+                        <w:rPr>
+                          <w:sz w:val="26"/>
+                          <w:szCs w:val="26"/>
+                        </w:rPr>
+                        <w:t xml:space="preserve"> </w:t>
+                      </w:r>
+                      <w:r>
+                        <w:rPr>
+                          <w:sz w:val="26"/>
+                          <w:szCs w:val="26"/>
+                        </w:rPr>
+                        <w:t xml:space="preserve">Setup </w:t>
+                      </w:r>
+                    </w:p>
+                    <w:p>
+                      <w:pPr>
+                        <w:jc w:val="center"/>
+                        <w:rPr>
+                          <w:sz w:val="40"/>
+                          <w:szCs w:val="40"/>
+                        </w:rPr>
+                      </w:pPr>
+                    </w:p>
+                  </w:txbxContent>
+                </v:textbox>
+              </v:rect>
+            </w:pict>
+          </mc:Fallback>
+        </mc:AlternateContent>
+      </w:r>
+      <w:r>
+        <w:rPr>
+          <w:noProof/>
+        </w:rPr>
+        <mc:AlternateContent>
+          <mc:Choice Requires="wps">
+            <w:drawing>
+              <wp:anchor distT="0" distB="0" distL="114300" distR="114300" simplePos="0" relativeHeight="251328000" behindDoc="0" locked="0" layoutInCell="1" allowOverlap="1" wp14:anchorId="0703352D" wp14:editId="06B408F8">
+                <wp:simplePos x="0" y="0"/>
+                <wp:positionH relativeFrom="column">
+                  <wp:posOffset>-404867</wp:posOffset>
+                </wp:positionH>
+                <wp:positionV relativeFrom="paragraph">
+                  <wp:posOffset>371</wp:posOffset>
+                </wp:positionV>
+                <wp:extent cx="1043796" cy="595222"/>
+                <wp:effectExtent l="0" t="0" r="23495" b="14605"/>
+                <wp:wrapNone/>
+                <wp:docPr id="1" name="Rectangle 1"/>
+                <wp:cNvGraphicFramePr/>
+                <a:graphic xmlns:a="http://schemas.openxmlformats.org/drawingml/2006/main">
+                  <a:graphicData uri="http://schemas.microsoft.com/office/word/2010/wordprocessingShape">
+                    <wps:wsp>
+                      <wps:cNvSpPr/>
+                      <wps:spPr>
+                        <a:xfrm>
+                          <a:off x="0" y="0"/>
+                          <a:ext cx="1043796" cy="595222"/>
                         </a:xfrm>
                         <a:prstGeom prst="rect">
                           <a:avLst/>
@@ -811,10 +3740,24 @@
                             </w:pPr>
                             <w:r>
                               <w:rPr>
-                                <w:sz w:val="40"/>
-                                <w:szCs w:val="40"/>
-                              </w:rPr>
-                              <w:t>Dataset Preprocessing</w:t>
+                                <w:sz w:val="26"/>
+                                <w:szCs w:val="26"/>
+                              </w:rPr>
+                              <w:t>Data</w:t>
+                            </w:r>
+                            <w:r>
+                              <w:rPr>
+                                <w:sz w:val="26"/>
+                                <w:szCs w:val="26"/>
+                              </w:rPr>
+                              <w:t xml:space="preserve"> </w:t>
+                            </w:r>
+                            <w:r>
+                              <w:rPr>
+                                <w:sz w:val="26"/>
+                                <w:szCs w:val="26"/>
+                              </w:rPr>
+                              <w:t>Collection</w:t>
                             </w:r>
                           </w:p>
                         </w:txbxContent>
@@ -828,12 +3771,18 @@
                     </wps:wsp>
                   </a:graphicData>
                 </a:graphic>
+                <wp14:sizeRelH relativeFrom="margin">
+                  <wp14:pctWidth>0</wp14:pctWidth>
+                </wp14:sizeRelH>
+                <wp14:sizeRelV relativeFrom="margin">
+                  <wp14:pctHeight>0</wp14:pctHeight>
+                </wp14:sizeRelV>
               </wp:anchor>
             </w:drawing>
           </mc:Choice>
           <mc:Fallback>
             <w:pict>
-              <v:rect w14:anchorId="0720A737" id="Rectangle 5" o:spid="_x0000_s1029" style="position:absolute;margin-left:273.15pt;margin-top:114.1pt;width:163.25pt;height:67.8pt;z-index:251678208;visibility:visible;mso-wrap-style:square;mso-wrap-distance-left:9pt;mso-wrap-distance-top:0;mso-wrap-distance-right:9pt;mso-wrap-distance-bottom:0;mso-position-horizontal:absolute;mso-position-horizontal-relative:text;mso-position-vertical:absolute;mso-position-vertical-relative:text;v-text-anchor:middle" o:gfxdata="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" fillcolor="#5a5a5a [2109]" strokecolor="#0a121c [484]" strokeweight="2pt">
+              <v:rect w14:anchorId="0703352D" id="Rectangle 1" o:spid="_x0000_s1041" style="position:absolute;margin-left:-31.9pt;margin-top:.05pt;width:82.2pt;height:46.85pt;z-index:251328000;visibility:visible;mso-wrap-style:square;mso-width-percent:0;mso-height-percent:0;mso-wrap-distance-left:9pt;mso-wrap-distance-top:0;mso-wrap-distance-right:9pt;mso-wrap-distance-bottom:0;mso-position-horizontal:absolute;mso-position-horizontal-relative:text;mso-position-vertical:absolute;mso-position-vertical-relative:text;mso-width-percent:0;mso-height-percent:0;mso-width-relative:margin;mso-height-relative:margin;v-text-anchor:middle" o:gfxdata="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" fillcolor="#5a5a5a [2109]" strokecolor="#0a121c [484]" strokeweight="2pt">
                 <v:textbox>
                   <w:txbxContent>
                     <w:p>
@@ -846,10 +3795,24 @@
                       </w:pPr>
                       <w:r>
                         <w:rPr>
-                          <w:sz w:val="40"/>
-                          <w:szCs w:val="40"/>
-                        </w:rPr>
-                        <w:t>Dataset Preprocessing</w:t>
+                          <w:sz w:val="26"/>
+                          <w:szCs w:val="26"/>
+                        </w:rPr>
+                        <w:t>Data</w:t>
+                      </w:r>
+                      <w:r>
+                        <w:rPr>
+                          <w:sz w:val="26"/>
+                          <w:szCs w:val="26"/>
+                        </w:rPr>
+                        <w:t xml:space="preserve"> </w:t>
+                      </w:r>
+                      <w:r>
+                        <w:rPr>
+                          <w:sz w:val="26"/>
+                          <w:szCs w:val="26"/>
+                        </w:rPr>
+                        <w:t>Collection</w:t>
                       </w:r>
                     </w:p>
                   </w:txbxContent>
@@ -866,18 +3829,18 @@
         <mc:AlternateContent>
           <mc:Choice Requires="wps">
             <w:drawing>
-              <wp:anchor distT="0" distB="0" distL="114300" distR="114300" simplePos="0" relativeHeight="251638272" behindDoc="0" locked="0" layoutInCell="1" allowOverlap="1" wp14:anchorId="294C40C2" wp14:editId="55A20804">
+              <wp:anchor distT="0" distB="0" distL="114300" distR="114300" simplePos="0" relativeHeight="251618816" behindDoc="0" locked="0" layoutInCell="1" allowOverlap="1" wp14:anchorId="6449BF4D" wp14:editId="0A04F583">
                 <wp:simplePos x="0" y="0"/>
                 <wp:positionH relativeFrom="column">
-                  <wp:posOffset>4616790</wp:posOffset>
+                  <wp:posOffset>758981</wp:posOffset>
                 </wp:positionH>
                 <wp:positionV relativeFrom="paragraph">
-                  <wp:posOffset>78416</wp:posOffset>
+                  <wp:posOffset>175979</wp:posOffset>
                 </wp:positionV>
-                <wp:extent cx="2073349" cy="861238"/>
-                <wp:effectExtent l="0" t="0" r="22225" b="15240"/>
+                <wp:extent cx="258792" cy="222490"/>
+                <wp:effectExtent l="0" t="19050" r="46355" b="44450"/>
                 <wp:wrapNone/>
-                <wp:docPr id="2" name="Rectangle 2"/>
+                <wp:docPr id="9" name="Arrow: Right 9"/>
                 <wp:cNvGraphicFramePr/>
                 <a:graphic xmlns:a="http://schemas.openxmlformats.org/drawingml/2006/main">
                   <a:graphicData uri="http://schemas.microsoft.com/office/word/2010/wordprocessingShape">
@@ -886,9 +3849,9 @@
                       <wps:spPr>
                         <a:xfrm>
                           <a:off x="0" y="0"/>
-                          <a:ext cx="2073349" cy="861238"/>
+                          <a:ext cx="258792" cy="222490"/>
                         </a:xfrm>
-                        <a:prstGeom prst="rect">
+                        <a:prstGeom prst="rightArrow">
                           <a:avLst/>
                         </a:prstGeom>
                         <a:solidFill>
@@ -914,40 +3877,6 @@
                           <a:schemeClr val="lt1"/>
                         </a:fontRef>
                       </wps:style>
-                      <wps:txbx>
-                        <w:txbxContent>
-                          <w:p>
-                            <w:pPr>
-                              <w:jc w:val="center"/>
-                              <w:rPr>
-                                <w:sz w:val="40"/>
-                                <w:szCs w:val="40"/>
-                              </w:rPr>
-                            </w:pPr>
-                            <w:r>
-                              <w:rPr>
-                                <w:sz w:val="40"/>
-                                <w:szCs w:val="40"/>
-                              </w:rPr>
-                              <w:t xml:space="preserve">Data </w:t>
-                            </w:r>
-                            <w:r>
-                              <w:rPr>
-                                <w:sz w:val="40"/>
-                                <w:szCs w:val="40"/>
-                              </w:rPr>
-                              <w:t>L</w:t>
-                            </w:r>
-                            <w:r>
-                              <w:rPr>
-                                <w:sz w:val="40"/>
-                                <w:szCs w:val="40"/>
-                              </w:rPr>
-                              <w:t>ogging</w:t>
-                            </w:r>
-                          </w:p>
-                        </w:txbxContent>
-                      </wps:txbx>
                       <wps:bodyPr rot="0" spcFirstLastPara="0" vertOverflow="overflow" horzOverflow="overflow" vert="horz" wrap="square" lIns="91440" tIns="45720" rIns="91440" bIns="45720" numCol="1" spcCol="0" rtlCol="0" fromWordArt="0" anchor="ctr" anchorCtr="0" forceAA="0" compatLnSpc="1">
                         <a:prstTxWarp prst="textNoShape">
                           <a:avLst/>
@@ -957,47 +3886,18 @@
                     </wps:wsp>
                   </a:graphicData>
                 </a:graphic>
+                <wp14:sizeRelH relativeFrom="margin">
+                  <wp14:pctWidth>0</wp14:pctWidth>
+                </wp14:sizeRelH>
+                <wp14:sizeRelV relativeFrom="margin">
+                  <wp14:pctHeight>0</wp14:pctHeight>
+                </wp14:sizeRelV>
               </wp:anchor>
             </w:drawing>
           </mc:Choice>
           <mc:Fallback>
             <w:pict>
-              <v:rect w14:anchorId="294C40C2" id="Rectangle 2" o:spid="_x0000_s1030" style="position:absolute;margin-left:363.55pt;margin-top:6.15pt;width:163.25pt;height:67.8pt;z-index:251638272;visibility:visible;mso-wrap-style:square;mso-wrap-distance-left:9pt;mso-wrap-distance-top:0;mso-wrap-distance-right:9pt;mso-wrap-distance-bottom:0;mso-position-horizontal:absolute;mso-position-horizontal-relative:text;mso-position-vertical:absolute;mso-position-vertical-relative:text;v-text-anchor:middle" o:gfxdata="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" fillcolor="#5a5a5a [2109]" strokecolor="#0a121c [484]" strokeweight="2pt">
-                <v:textbox>
-                  <w:txbxContent>
-                    <w:p>
-                      <w:pPr>
-                        <w:jc w:val="center"/>
-                        <w:rPr>
-                          <w:sz w:val="40"/>
-                          <w:szCs w:val="40"/>
-                        </w:rPr>
-                      </w:pPr>
-                      <w:r>
-                        <w:rPr>
-                          <w:sz w:val="40"/>
-                          <w:szCs w:val="40"/>
-                        </w:rPr>
-                        <w:t xml:space="preserve">Data </w:t>
-                      </w:r>
-                      <w:r>
-                        <w:rPr>
-                          <w:sz w:val="40"/>
-                          <w:szCs w:val="40"/>
-                        </w:rPr>
-                        <w:t>L</w:t>
-                      </w:r>
-                      <w:r>
-                        <w:rPr>
-                          <w:sz w:val="40"/>
-                          <w:szCs w:val="40"/>
-                        </w:rPr>
-                        <w:t>ogging</w:t>
-                      </w:r>
-                    </w:p>
-                  </w:txbxContent>
-                </v:textbox>
-              </v:rect>
+              <v:shape w14:anchorId="222598B4" id="Arrow: Right 9" o:spid="_x0000_s1026" type="#_x0000_t13" style="position:absolute;margin-left:59.75pt;margin-top:13.85pt;width:20.4pt;height:17.5pt;z-index:251618816;visibility:visible;mso-wrap-style:square;mso-width-percent:0;mso-height-percent:0;mso-wrap-distance-left:9pt;mso-wrap-distance-top:0;mso-wrap-distance-right:9pt;mso-wrap-distance-bottom:0;mso-position-horizontal:absolute;mso-position-horizontal-relative:text;mso-position-vertical:absolute;mso-position-vertical-relative:text;mso-width-percent:0;mso-height-percent:0;mso-width-relative:margin;mso-height-relative:margin;v-text-anchor:middle" o:gfxdata="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" adj="12315" fillcolor="#5a5a5a [2109]" strokecolor="#0a121c [484]" strokeweight="2pt"/>
             </w:pict>
           </mc:Fallback>
         </mc:AlternateContent>
@@ -1616,7 +4516,6 @@
   <w:style w:type="character" w:default="1" w:styleId="DefaultParagraphFont">
     <w:name w:val="Default Paragraph Font"/>
     <w:uiPriority w:val="1"/>
-    <w:semiHidden/>
     <w:unhideWhenUsed/>
   </w:style>
   <w:style w:type="table" w:default="1" w:styleId="TableNormal">

</xml_diff>